<commit_message>
:wrench: #build 1.Criando arquivos de configuracao de Docker, Mongo, e Postgree 2. Criado Diretorios 3. Atualizacao da documentacao.
</commit_message>
<xml_diff>
--- a/SGHSS DOC.docx
+++ b/SGHSS DOC.docx
@@ -7486,7 +7486,7 @@
     <w:p>
       <w:r>
         <w:drawing>
-          <wp:inline wp14:editId="771691F7" wp14:anchorId="4D35B940">
+          <wp:inline wp14:editId="31AA118B" wp14:anchorId="4D35B940">
             <wp:extent cx="5724525" cy="5724525"/>
             <wp:effectExtent l="0" t="0" r="0" b="0"/>
             <wp:docPr id="990458503" name="drawing"/>
@@ -13167,6 +13167,2263 @@
     </w:p>
     <w:p>
       <w:pPr>
+        <w:pStyle w:val="Ttulo2"/>
+        <w:rPr>
+          <w:rFonts w:ascii="Aptos" w:hAnsi="Aptos" w:eastAsia="Aptos"/>
+          <w:noProof w:val="0"/>
+          <w:sz w:val="24"/>
+          <w:szCs w:val="24"/>
+          <w:lang w:val="pt-BR"/>
+        </w:rPr>
+      </w:pPr>
+      <w:r>
+        <w:rPr>
+          <w:noProof w:val="0"/>
+          <w:lang w:val="pt-BR"/>
+        </w:rPr>
+        <w:t>Arquitetura de Software e Tecnologias</w:t>
+      </w:r>
+    </w:p>
+    <w:p>
+      <w:pPr>
+        <w:pStyle w:val="Ttulo3"/>
+        <w:rPr>
+          <w:rFonts w:ascii="Aptos" w:hAnsi="Aptos" w:eastAsia="Aptos" w:cs="Aptos"/>
+          <w:b w:val="1"/>
+          <w:bCs w:val="1"/>
+          <w:noProof w:val="0"/>
+          <w:sz w:val="24"/>
+          <w:szCs w:val="24"/>
+          <w:lang w:val="pt-BR"/>
+        </w:rPr>
+      </w:pPr>
+      <w:r>
+        <w:rPr>
+          <w:noProof w:val="0"/>
+          <w:lang w:val="pt-BR"/>
+        </w:rPr>
+        <w:t>Monolito Principal (</w:t>
+      </w:r>
+      <w:r>
+        <w:rPr>
+          <w:noProof w:val="0"/>
+          <w:lang w:val="pt-BR"/>
+        </w:rPr>
+        <w:t>Backend</w:t>
+      </w:r>
+      <w:r>
+        <w:rPr>
+          <w:noProof w:val="0"/>
+          <w:lang w:val="pt-BR"/>
+        </w:rPr>
+        <w:t xml:space="preserve"> para Web/Desktop)</w:t>
+      </w:r>
+    </w:p>
+    <w:p>
+      <w:pPr>
+        <w:pStyle w:val="PargrafodaLista"/>
+        <w:numPr>
+          <w:ilvl w:val="1"/>
+          <w:numId w:val="49"/>
+        </w:numPr>
+        <w:spacing w:before="240" w:beforeAutospacing="off" w:after="240" w:afterAutospacing="off"/>
+        <w:rPr>
+          <w:rFonts w:ascii="Aptos" w:hAnsi="Aptos" w:eastAsia="Aptos" w:cs="Aptos"/>
+          <w:noProof w:val="0"/>
+          <w:sz w:val="24"/>
+          <w:szCs w:val="24"/>
+          <w:lang w:val="pt-BR"/>
+        </w:rPr>
+      </w:pPr>
+      <w:r>
+        <w:rPr>
+          <w:rFonts w:ascii="Aptos" w:hAnsi="Aptos" w:eastAsia="Aptos" w:cs="Aptos"/>
+          <w:b w:val="1"/>
+          <w:bCs w:val="1"/>
+          <w:noProof w:val="0"/>
+          <w:sz w:val="24"/>
+          <w:szCs w:val="24"/>
+          <w:lang w:val="pt-BR"/>
+        </w:rPr>
+        <w:t>Linguagem de Programação:</w:t>
+      </w:r>
+      <w:r>
+        <w:rPr>
+          <w:rFonts w:ascii="Aptos" w:hAnsi="Aptos" w:eastAsia="Aptos" w:cs="Aptos"/>
+          <w:noProof w:val="0"/>
+          <w:sz w:val="24"/>
+          <w:szCs w:val="24"/>
+          <w:lang w:val="pt-BR"/>
+        </w:rPr>
+        <w:t xml:space="preserve"> </w:t>
+      </w:r>
+      <w:r>
+        <w:rPr>
+          <w:rFonts w:ascii="Aptos" w:hAnsi="Aptos" w:eastAsia="Aptos" w:cs="Aptos"/>
+          <w:b w:val="1"/>
+          <w:bCs w:val="1"/>
+          <w:noProof w:val="0"/>
+          <w:sz w:val="24"/>
+          <w:szCs w:val="24"/>
+          <w:lang w:val="pt-BR"/>
+        </w:rPr>
+        <w:t>Python</w:t>
+      </w:r>
+      <w:r>
+        <w:rPr>
+          <w:rFonts w:ascii="Aptos" w:hAnsi="Aptos" w:eastAsia="Aptos" w:cs="Aptos"/>
+          <w:noProof w:val="0"/>
+          <w:sz w:val="24"/>
+          <w:szCs w:val="24"/>
+          <w:lang w:val="pt-BR"/>
+        </w:rPr>
+        <w:t>. Você já tem conhecimento, e a linguagem é extremamente versátil e requisitada para desenvolvimento web.</w:t>
+      </w:r>
+    </w:p>
+    <w:p>
+      <w:pPr>
+        <w:pStyle w:val="PargrafodaLista"/>
+        <w:numPr>
+          <w:ilvl w:val="1"/>
+          <w:numId w:val="49"/>
+        </w:numPr>
+        <w:spacing w:before="240" w:beforeAutospacing="off" w:after="240" w:afterAutospacing="off"/>
+        <w:rPr>
+          <w:rFonts w:ascii="Aptos" w:hAnsi="Aptos" w:eastAsia="Aptos" w:cs="Aptos"/>
+          <w:noProof w:val="0"/>
+          <w:sz w:val="24"/>
+          <w:szCs w:val="24"/>
+          <w:lang w:val="pt-BR"/>
+        </w:rPr>
+      </w:pPr>
+      <w:r>
+        <w:rPr>
+          <w:rFonts w:ascii="Aptos" w:hAnsi="Aptos" w:eastAsia="Aptos" w:cs="Aptos"/>
+          <w:b w:val="1"/>
+          <w:bCs w:val="1"/>
+          <w:noProof w:val="0"/>
+          <w:sz w:val="24"/>
+          <w:szCs w:val="24"/>
+          <w:lang w:val="pt-BR"/>
+        </w:rPr>
+        <w:t>Framework:</w:t>
+      </w:r>
+      <w:r>
+        <w:rPr>
+          <w:rFonts w:ascii="Aptos" w:hAnsi="Aptos" w:eastAsia="Aptos" w:cs="Aptos"/>
+          <w:noProof w:val="0"/>
+          <w:sz w:val="24"/>
+          <w:szCs w:val="24"/>
+          <w:lang w:val="pt-BR"/>
+        </w:rPr>
+        <w:t xml:space="preserve"> </w:t>
+      </w:r>
+      <w:r>
+        <w:rPr>
+          <w:rFonts w:ascii="Aptos" w:hAnsi="Aptos" w:eastAsia="Aptos" w:cs="Aptos"/>
+          <w:b w:val="1"/>
+          <w:bCs w:val="1"/>
+          <w:noProof w:val="0"/>
+          <w:sz w:val="24"/>
+          <w:szCs w:val="24"/>
+          <w:lang w:val="pt-BR"/>
+        </w:rPr>
+        <w:t>Django</w:t>
+      </w:r>
+      <w:r>
+        <w:rPr>
+          <w:rFonts w:ascii="Aptos" w:hAnsi="Aptos" w:eastAsia="Aptos" w:cs="Aptos"/>
+          <w:noProof w:val="0"/>
+          <w:sz w:val="24"/>
+          <w:szCs w:val="24"/>
+          <w:lang w:val="pt-BR"/>
+        </w:rPr>
+        <w:t xml:space="preserve"> ou </w:t>
+      </w:r>
+      <w:r>
+        <w:rPr>
+          <w:rFonts w:ascii="Aptos" w:hAnsi="Aptos" w:eastAsia="Aptos" w:cs="Aptos"/>
+          <w:b w:val="1"/>
+          <w:bCs w:val="1"/>
+          <w:noProof w:val="0"/>
+          <w:sz w:val="24"/>
+          <w:szCs w:val="24"/>
+          <w:lang w:val="pt-BR"/>
+        </w:rPr>
+        <w:t>Flask</w:t>
+      </w:r>
+      <w:r>
+        <w:rPr>
+          <w:rFonts w:ascii="Aptos" w:hAnsi="Aptos" w:eastAsia="Aptos" w:cs="Aptos"/>
+          <w:noProof w:val="0"/>
+          <w:sz w:val="24"/>
+          <w:szCs w:val="24"/>
+          <w:lang w:val="pt-BR"/>
+        </w:rPr>
+        <w:t>. O Django é um framework completo (baterias incluídas), perfeito para um monolito. O Flask é mais minimalista e ideal se você quiser construir o projeto do zero, com mais controle. O Django seria mais rápido de implementar para o seu prazo.</w:t>
+      </w:r>
+    </w:p>
+    <w:p>
+      <w:pPr>
+        <w:pStyle w:val="PargrafodaLista"/>
+        <w:numPr>
+          <w:ilvl w:val="1"/>
+          <w:numId w:val="49"/>
+        </w:numPr>
+        <w:spacing w:before="240" w:beforeAutospacing="off" w:after="240" w:afterAutospacing="off"/>
+        <w:rPr>
+          <w:rFonts w:ascii="Aptos" w:hAnsi="Aptos" w:eastAsia="Aptos" w:cs="Aptos"/>
+          <w:noProof w:val="0"/>
+          <w:sz w:val="24"/>
+          <w:szCs w:val="24"/>
+          <w:lang w:val="pt-BR"/>
+        </w:rPr>
+      </w:pPr>
+      <w:r>
+        <w:rPr>
+          <w:rFonts w:ascii="Aptos" w:hAnsi="Aptos" w:eastAsia="Aptos" w:cs="Aptos"/>
+          <w:b w:val="1"/>
+          <w:bCs w:val="1"/>
+          <w:noProof w:val="0"/>
+          <w:sz w:val="24"/>
+          <w:szCs w:val="24"/>
+          <w:lang w:val="pt-BR"/>
+        </w:rPr>
+        <w:t>Banco de Dados Relacional:</w:t>
+      </w:r>
+      <w:r>
+        <w:rPr>
+          <w:rFonts w:ascii="Aptos" w:hAnsi="Aptos" w:eastAsia="Aptos" w:cs="Aptos"/>
+          <w:noProof w:val="0"/>
+          <w:sz w:val="24"/>
+          <w:szCs w:val="24"/>
+          <w:lang w:val="pt-BR"/>
+        </w:rPr>
+        <w:t xml:space="preserve"> </w:t>
+      </w:r>
+      <w:r>
+        <w:rPr>
+          <w:rFonts w:ascii="Aptos" w:hAnsi="Aptos" w:eastAsia="Aptos" w:cs="Aptos"/>
+          <w:b w:val="1"/>
+          <w:bCs w:val="1"/>
+          <w:noProof w:val="0"/>
+          <w:sz w:val="24"/>
+          <w:szCs w:val="24"/>
+          <w:lang w:val="pt-BR"/>
+        </w:rPr>
+        <w:t>PostgreSQL</w:t>
+      </w:r>
+      <w:r>
+        <w:rPr>
+          <w:rFonts w:ascii="Aptos" w:hAnsi="Aptos" w:eastAsia="Aptos" w:cs="Aptos"/>
+          <w:noProof w:val="0"/>
+          <w:sz w:val="24"/>
+          <w:szCs w:val="24"/>
+          <w:lang w:val="pt-BR"/>
+        </w:rPr>
+        <w:t>. É um dos bancos de dados mais robustos e populares do mercado. Ele vai gerenciar a maior parte dos dados do sistema (prontuários, agendamentos, usuários).</w:t>
+      </w:r>
+    </w:p>
+    <w:p>
+      <w:pPr>
+        <w:pStyle w:val="PargrafodaLista"/>
+        <w:numPr>
+          <w:ilvl w:val="1"/>
+          <w:numId w:val="49"/>
+        </w:numPr>
+        <w:spacing w:before="240" w:beforeAutospacing="off" w:after="240" w:afterAutospacing="off"/>
+        <w:rPr>
+          <w:rFonts w:ascii="Aptos" w:hAnsi="Aptos" w:eastAsia="Aptos" w:cs="Aptos"/>
+          <w:noProof w:val="0"/>
+          <w:sz w:val="24"/>
+          <w:szCs w:val="24"/>
+          <w:lang w:val="pt-BR"/>
+        </w:rPr>
+      </w:pPr>
+      <w:r>
+        <w:rPr>
+          <w:rFonts w:ascii="Aptos" w:hAnsi="Aptos" w:eastAsia="Aptos" w:cs="Aptos"/>
+          <w:b w:val="1"/>
+          <w:bCs w:val="1"/>
+          <w:noProof w:val="0"/>
+          <w:sz w:val="24"/>
+          <w:szCs w:val="24"/>
+          <w:lang w:val="pt-BR"/>
+        </w:rPr>
+        <w:t>Acesso a Dados:</w:t>
+      </w:r>
+      <w:r>
+        <w:rPr>
+          <w:rFonts w:ascii="Aptos" w:hAnsi="Aptos" w:eastAsia="Aptos" w:cs="Aptos"/>
+          <w:noProof w:val="0"/>
+          <w:sz w:val="24"/>
+          <w:szCs w:val="24"/>
+          <w:lang w:val="pt-BR"/>
+        </w:rPr>
+        <w:t xml:space="preserve"> Usaremos um </w:t>
+      </w:r>
+      <w:r>
+        <w:rPr>
+          <w:rFonts w:ascii="Aptos" w:hAnsi="Aptos" w:eastAsia="Aptos" w:cs="Aptos"/>
+          <w:b w:val="1"/>
+          <w:bCs w:val="1"/>
+          <w:noProof w:val="0"/>
+          <w:sz w:val="24"/>
+          <w:szCs w:val="24"/>
+          <w:lang w:val="pt-BR"/>
+        </w:rPr>
+        <w:t>ORM (Object-Relational Mapper)</w:t>
+      </w:r>
+      <w:r>
+        <w:rPr>
+          <w:rFonts w:ascii="Aptos" w:hAnsi="Aptos" w:eastAsia="Aptos" w:cs="Aptos"/>
+          <w:noProof w:val="0"/>
+          <w:sz w:val="24"/>
+          <w:szCs w:val="24"/>
+          <w:lang w:val="pt-BR"/>
+        </w:rPr>
+        <w:t>, como o Django ORM ou o SQLAlchemy. Isso permite interagir com o banco de dados usando objetos Python, o que simplifica o desenvolvimento.</w:t>
+      </w:r>
+    </w:p>
+    <w:p>
+      <w:pPr>
+        <w:pStyle w:val="Ttulo3"/>
+        <w:rPr>
+          <w:rFonts w:ascii="Aptos" w:hAnsi="Aptos" w:eastAsia="Aptos" w:cs="Aptos"/>
+          <w:b w:val="1"/>
+          <w:bCs w:val="1"/>
+          <w:noProof w:val="0"/>
+          <w:sz w:val="24"/>
+          <w:szCs w:val="24"/>
+          <w:lang w:val="pt-BR"/>
+        </w:rPr>
+      </w:pPr>
+      <w:r>
+        <w:rPr>
+          <w:noProof w:val="0"/>
+          <w:lang w:val="pt-BR"/>
+        </w:rPr>
+        <w:t>Microsserviço de Autenticação (</w:t>
+      </w:r>
+      <w:r>
+        <w:rPr>
+          <w:noProof w:val="0"/>
+          <w:lang w:val="pt-BR"/>
+        </w:rPr>
+        <w:t>Authentication</w:t>
+      </w:r>
+      <w:r>
+        <w:rPr>
+          <w:noProof w:val="0"/>
+          <w:lang w:val="pt-BR"/>
+        </w:rPr>
+        <w:t xml:space="preserve"> Service)</w:t>
+      </w:r>
+    </w:p>
+    <w:p>
+      <w:pPr>
+        <w:pStyle w:val="PargrafodaLista"/>
+        <w:numPr>
+          <w:ilvl w:val="1"/>
+          <w:numId w:val="49"/>
+        </w:numPr>
+        <w:spacing w:before="240" w:beforeAutospacing="off" w:after="240" w:afterAutospacing="off"/>
+        <w:rPr>
+          <w:rFonts w:ascii="Aptos" w:hAnsi="Aptos" w:eastAsia="Aptos" w:cs="Aptos"/>
+          <w:noProof w:val="0"/>
+          <w:sz w:val="24"/>
+          <w:szCs w:val="24"/>
+          <w:lang w:val="pt-BR"/>
+        </w:rPr>
+      </w:pPr>
+      <w:r>
+        <w:rPr>
+          <w:rFonts w:ascii="Aptos" w:hAnsi="Aptos" w:eastAsia="Aptos" w:cs="Aptos"/>
+          <w:b w:val="1"/>
+          <w:bCs w:val="1"/>
+          <w:noProof w:val="0"/>
+          <w:sz w:val="24"/>
+          <w:szCs w:val="24"/>
+          <w:lang w:val="pt-BR"/>
+        </w:rPr>
+        <w:t>Linguagem de Programação:</w:t>
+      </w:r>
+      <w:r>
+        <w:rPr>
+          <w:rFonts w:ascii="Aptos" w:hAnsi="Aptos" w:eastAsia="Aptos" w:cs="Aptos"/>
+          <w:noProof w:val="0"/>
+          <w:sz w:val="24"/>
+          <w:szCs w:val="24"/>
+          <w:lang w:val="pt-BR"/>
+        </w:rPr>
+        <w:t xml:space="preserve"> </w:t>
+      </w:r>
+      <w:r>
+        <w:rPr>
+          <w:rFonts w:ascii="Aptos" w:hAnsi="Aptos" w:eastAsia="Aptos" w:cs="Aptos"/>
+          <w:b w:val="1"/>
+          <w:bCs w:val="1"/>
+          <w:noProof w:val="0"/>
+          <w:sz w:val="24"/>
+          <w:szCs w:val="24"/>
+          <w:lang w:val="pt-BR"/>
+        </w:rPr>
+        <w:t>Python (Flask)</w:t>
+      </w:r>
+      <w:r>
+        <w:rPr>
+          <w:rFonts w:ascii="Aptos" w:hAnsi="Aptos" w:eastAsia="Aptos" w:cs="Aptos"/>
+          <w:noProof w:val="0"/>
+          <w:sz w:val="24"/>
+          <w:szCs w:val="24"/>
+          <w:lang w:val="pt-BR"/>
+        </w:rPr>
+        <w:t>. Usar Flask aqui é uma ótima escolha. É leve e ideal para um serviço pequeno e específico como a autenticação.</w:t>
+      </w:r>
+    </w:p>
+    <w:p>
+      <w:pPr>
+        <w:pStyle w:val="PargrafodaLista"/>
+        <w:numPr>
+          <w:ilvl w:val="1"/>
+          <w:numId w:val="49"/>
+        </w:numPr>
+        <w:spacing w:before="240" w:beforeAutospacing="off" w:after="240" w:afterAutospacing="off"/>
+        <w:rPr>
+          <w:rFonts w:ascii="Aptos" w:hAnsi="Aptos" w:eastAsia="Aptos" w:cs="Aptos"/>
+          <w:noProof w:val="0"/>
+          <w:sz w:val="24"/>
+          <w:szCs w:val="24"/>
+          <w:lang w:val="pt-BR"/>
+        </w:rPr>
+      </w:pPr>
+      <w:r>
+        <w:rPr>
+          <w:rFonts w:ascii="Aptos" w:hAnsi="Aptos" w:eastAsia="Aptos" w:cs="Aptos"/>
+          <w:b w:val="1"/>
+          <w:bCs w:val="1"/>
+          <w:noProof w:val="0"/>
+          <w:sz w:val="24"/>
+          <w:szCs w:val="24"/>
+          <w:lang w:val="pt-BR"/>
+        </w:rPr>
+        <w:t>Banco de Dados NoSQL:</w:t>
+      </w:r>
+      <w:r>
+        <w:rPr>
+          <w:rFonts w:ascii="Aptos" w:hAnsi="Aptos" w:eastAsia="Aptos" w:cs="Aptos"/>
+          <w:noProof w:val="0"/>
+          <w:sz w:val="24"/>
+          <w:szCs w:val="24"/>
+          <w:lang w:val="pt-BR"/>
+        </w:rPr>
+        <w:t xml:space="preserve"> </w:t>
+      </w:r>
+      <w:r>
+        <w:rPr>
+          <w:rFonts w:ascii="Aptos" w:hAnsi="Aptos" w:eastAsia="Aptos" w:cs="Aptos"/>
+          <w:b w:val="1"/>
+          <w:bCs w:val="1"/>
+          <w:noProof w:val="0"/>
+          <w:sz w:val="24"/>
+          <w:szCs w:val="24"/>
+          <w:lang w:val="pt-BR"/>
+        </w:rPr>
+        <w:t>MongoDB</w:t>
+      </w:r>
+      <w:r>
+        <w:rPr>
+          <w:rFonts w:ascii="Aptos" w:hAnsi="Aptos" w:eastAsia="Aptos" w:cs="Aptos"/>
+          <w:noProof w:val="0"/>
+          <w:sz w:val="24"/>
+          <w:szCs w:val="24"/>
+          <w:lang w:val="pt-BR"/>
+        </w:rPr>
+        <w:t>. Você mencionou o interesse em NoSQL. O MongoDB é amplamente usado para registrar logs e dados não estruturados. Podemos usá-lo para armazenar os logs de acesso e auditoria, como você sugeriu.</w:t>
+      </w:r>
+    </w:p>
+    <w:p>
+      <w:pPr>
+        <w:pStyle w:val="PargrafodaLista"/>
+        <w:numPr>
+          <w:ilvl w:val="1"/>
+          <w:numId w:val="49"/>
+        </w:numPr>
+        <w:spacing w:before="240" w:beforeAutospacing="off" w:after="240" w:afterAutospacing="off"/>
+        <w:rPr>
+          <w:rFonts w:ascii="Aptos" w:hAnsi="Aptos" w:eastAsia="Aptos" w:cs="Aptos"/>
+          <w:noProof w:val="0"/>
+          <w:sz w:val="24"/>
+          <w:szCs w:val="24"/>
+          <w:lang w:val="pt-BR"/>
+        </w:rPr>
+      </w:pPr>
+      <w:r>
+        <w:rPr>
+          <w:rFonts w:ascii="Aptos" w:hAnsi="Aptos" w:eastAsia="Aptos" w:cs="Aptos"/>
+          <w:b w:val="1"/>
+          <w:bCs w:val="1"/>
+          <w:noProof w:val="0"/>
+          <w:sz w:val="24"/>
+          <w:szCs w:val="24"/>
+          <w:lang w:val="pt-BR"/>
+        </w:rPr>
+        <w:t>Comunicação:</w:t>
+      </w:r>
+      <w:r>
+        <w:rPr>
+          <w:rFonts w:ascii="Aptos" w:hAnsi="Aptos" w:eastAsia="Aptos" w:cs="Aptos"/>
+          <w:noProof w:val="0"/>
+          <w:sz w:val="24"/>
+          <w:szCs w:val="24"/>
+          <w:lang w:val="pt-BR"/>
+        </w:rPr>
+        <w:t xml:space="preserve"> A comunicação entre o monolito principal e este microsserviço será via </w:t>
+      </w:r>
+      <w:r>
+        <w:rPr>
+          <w:rFonts w:ascii="Aptos" w:hAnsi="Aptos" w:eastAsia="Aptos" w:cs="Aptos"/>
+          <w:b w:val="1"/>
+          <w:bCs w:val="1"/>
+          <w:noProof w:val="0"/>
+          <w:sz w:val="24"/>
+          <w:szCs w:val="24"/>
+          <w:lang w:val="pt-BR"/>
+        </w:rPr>
+        <w:t>API REST</w:t>
+      </w:r>
+      <w:r>
+        <w:rPr>
+          <w:rFonts w:ascii="Aptos" w:hAnsi="Aptos" w:eastAsia="Aptos" w:cs="Aptos"/>
+          <w:noProof w:val="0"/>
+          <w:sz w:val="24"/>
+          <w:szCs w:val="24"/>
+          <w:lang w:val="pt-BR"/>
+        </w:rPr>
+        <w:t xml:space="preserve"> usando </w:t>
+      </w:r>
+      <w:r>
+        <w:rPr>
+          <w:rFonts w:ascii="Aptos" w:hAnsi="Aptos" w:eastAsia="Aptos" w:cs="Aptos"/>
+          <w:b w:val="1"/>
+          <w:bCs w:val="1"/>
+          <w:noProof w:val="0"/>
+          <w:sz w:val="24"/>
+          <w:szCs w:val="24"/>
+          <w:lang w:val="pt-BR"/>
+        </w:rPr>
+        <w:t>JSON Web Tokens (JWT)</w:t>
+      </w:r>
+      <w:r>
+        <w:rPr>
+          <w:rFonts w:ascii="Aptos" w:hAnsi="Aptos" w:eastAsia="Aptos" w:cs="Aptos"/>
+          <w:noProof w:val="0"/>
+          <w:sz w:val="24"/>
+          <w:szCs w:val="24"/>
+          <w:lang w:val="pt-BR"/>
+        </w:rPr>
+        <w:t>, como planejamos.</w:t>
+      </w:r>
+    </w:p>
+    <w:p>
+      <w:pPr>
+        <w:pStyle w:val="Ttulo3"/>
+        <w:rPr>
+          <w:rFonts w:ascii="Aptos" w:hAnsi="Aptos" w:eastAsia="Aptos" w:cs="Aptos"/>
+          <w:b w:val="1"/>
+          <w:bCs w:val="1"/>
+          <w:noProof w:val="0"/>
+          <w:sz w:val="24"/>
+          <w:szCs w:val="24"/>
+          <w:lang w:val="pt-BR"/>
+        </w:rPr>
+      </w:pPr>
+      <w:r>
+        <w:rPr>
+          <w:noProof w:val="0"/>
+          <w:lang w:val="pt-BR"/>
+        </w:rPr>
+        <w:t>Microsserviço de Telemedicina (</w:t>
+      </w:r>
+      <w:r>
+        <w:rPr>
+          <w:noProof w:val="0"/>
+          <w:lang w:val="pt-BR"/>
+        </w:rPr>
+        <w:t>Video</w:t>
+      </w:r>
+      <w:r>
+        <w:rPr>
+          <w:noProof w:val="0"/>
+          <w:lang w:val="pt-BR"/>
+        </w:rPr>
+        <w:t xml:space="preserve"> Service)</w:t>
+      </w:r>
+    </w:p>
+    <w:p>
+      <w:pPr>
+        <w:pStyle w:val="PargrafodaLista"/>
+        <w:numPr>
+          <w:ilvl w:val="1"/>
+          <w:numId w:val="49"/>
+        </w:numPr>
+        <w:spacing w:before="240" w:beforeAutospacing="off" w:after="240" w:afterAutospacing="off"/>
+        <w:rPr>
+          <w:rFonts w:ascii="Aptos" w:hAnsi="Aptos" w:eastAsia="Aptos" w:cs="Aptos"/>
+          <w:noProof w:val="0"/>
+          <w:sz w:val="24"/>
+          <w:szCs w:val="24"/>
+          <w:lang w:val="pt-BR"/>
+        </w:rPr>
+      </w:pPr>
+      <w:r>
+        <w:rPr>
+          <w:rFonts w:ascii="Aptos" w:hAnsi="Aptos" w:eastAsia="Aptos" w:cs="Aptos"/>
+          <w:b w:val="1"/>
+          <w:bCs w:val="1"/>
+          <w:noProof w:val="0"/>
+          <w:sz w:val="24"/>
+          <w:szCs w:val="24"/>
+          <w:lang w:val="pt-BR"/>
+        </w:rPr>
+        <w:t>Integração:</w:t>
+      </w:r>
+      <w:r>
+        <w:rPr>
+          <w:rFonts w:ascii="Aptos" w:hAnsi="Aptos" w:eastAsia="Aptos" w:cs="Aptos"/>
+          <w:noProof w:val="0"/>
+          <w:sz w:val="24"/>
+          <w:szCs w:val="24"/>
+          <w:lang w:val="pt-BR"/>
+        </w:rPr>
+        <w:t xml:space="preserve"> Usaremos um serviço externo como </w:t>
+      </w:r>
+      <w:r>
+        <w:rPr>
+          <w:rFonts w:ascii="Aptos" w:hAnsi="Aptos" w:eastAsia="Aptos" w:cs="Aptos"/>
+          <w:b w:val="1"/>
+          <w:bCs w:val="1"/>
+          <w:noProof w:val="0"/>
+          <w:sz w:val="24"/>
+          <w:szCs w:val="24"/>
+          <w:lang w:val="pt-BR"/>
+        </w:rPr>
+        <w:t>Jitsi</w:t>
+      </w:r>
+      <w:r>
+        <w:rPr>
+          <w:rFonts w:ascii="Aptos" w:hAnsi="Aptos" w:eastAsia="Aptos" w:cs="Aptos"/>
+          <w:noProof w:val="0"/>
+          <w:sz w:val="24"/>
+          <w:szCs w:val="24"/>
+          <w:lang w:val="pt-BR"/>
+        </w:rPr>
+        <w:t xml:space="preserve"> ou </w:t>
+      </w:r>
+      <w:r>
+        <w:rPr>
+          <w:rFonts w:ascii="Aptos" w:hAnsi="Aptos" w:eastAsia="Aptos" w:cs="Aptos"/>
+          <w:b w:val="1"/>
+          <w:bCs w:val="1"/>
+          <w:noProof w:val="0"/>
+          <w:sz w:val="24"/>
+          <w:szCs w:val="24"/>
+          <w:lang w:val="pt-BR"/>
+        </w:rPr>
+        <w:t>Twilio Video</w:t>
+      </w:r>
+      <w:r>
+        <w:rPr>
+          <w:rFonts w:ascii="Aptos" w:hAnsi="Aptos" w:eastAsia="Aptos" w:cs="Aptos"/>
+          <w:noProof w:val="0"/>
+          <w:sz w:val="24"/>
+          <w:szCs w:val="24"/>
+          <w:lang w:val="pt-BR"/>
+        </w:rPr>
+        <w:t>, com uma pequena camada de API em Python/Flask para orquestrar as chamadas. Este serviço não precisará de um banco de dados próprio, já que sua função é apenas gerenciar a conexão de vídeo.</w:t>
+      </w:r>
+    </w:p>
+    <w:p/>
+    <w:p>
+      <w:pPr>
+        <w:pStyle w:val="Ttulo3"/>
+        <w:rPr>
+          <w:noProof w:val="0"/>
+          <w:lang w:val="pt-BR"/>
+        </w:rPr>
+      </w:pPr>
+      <w:r>
+        <w:rPr>
+          <w:noProof w:val="0"/>
+          <w:lang w:val="pt-BR"/>
+        </w:rPr>
+        <w:t xml:space="preserve">Sobre o Acesso do </w:t>
+      </w:r>
+      <w:r>
+        <w:rPr>
+          <w:noProof w:val="0"/>
+          <w:lang w:val="pt-BR"/>
+        </w:rPr>
+        <w:t>Frontend</w:t>
+      </w:r>
+    </w:p>
+    <w:p>
+      <w:pPr>
+        <w:spacing w:before="240" w:beforeAutospacing="off" w:after="240" w:afterAutospacing="off"/>
+      </w:pPr>
+      <w:r>
+        <w:rPr>
+          <w:rFonts w:ascii="Aptos" w:hAnsi="Aptos" w:eastAsia="Aptos" w:cs="Aptos"/>
+          <w:noProof w:val="0"/>
+          <w:sz w:val="24"/>
+          <w:szCs w:val="24"/>
+          <w:lang w:val="pt-BR"/>
+        </w:rPr>
+        <w:t>Você tem toda a razão. O front-end (seja web, desktop ou mobile) não se importa com a estrutura interna do seu back-end. A lógica de todas as requisições deve ser a mesma para qualquer cliente.</w:t>
+      </w:r>
+    </w:p>
+    <w:p>
+      <w:pPr>
+        <w:pStyle w:val="PargrafodaLista"/>
+        <w:numPr>
+          <w:ilvl w:val="0"/>
+          <w:numId w:val="50"/>
+        </w:numPr>
+        <w:spacing w:before="240" w:beforeAutospacing="off" w:after="240" w:afterAutospacing="off"/>
+        <w:rPr>
+          <w:rFonts w:ascii="Aptos" w:hAnsi="Aptos" w:eastAsia="Aptos" w:cs="Aptos"/>
+          <w:noProof w:val="0"/>
+          <w:sz w:val="24"/>
+          <w:szCs w:val="24"/>
+          <w:lang w:val="pt-BR"/>
+        </w:rPr>
+      </w:pPr>
+      <w:r>
+        <w:rPr>
+          <w:rFonts w:ascii="Aptos" w:hAnsi="Aptos" w:eastAsia="Aptos" w:cs="Aptos"/>
+          <w:b w:val="1"/>
+          <w:bCs w:val="1"/>
+          <w:noProof w:val="0"/>
+          <w:sz w:val="24"/>
+          <w:szCs w:val="24"/>
+          <w:lang w:val="pt-BR"/>
+        </w:rPr>
+        <w:t>API REST:</w:t>
+      </w:r>
+      <w:r>
+        <w:rPr>
+          <w:rFonts w:ascii="Aptos" w:hAnsi="Aptos" w:eastAsia="Aptos" w:cs="Aptos"/>
+          <w:noProof w:val="0"/>
+          <w:sz w:val="24"/>
+          <w:szCs w:val="24"/>
+          <w:lang w:val="pt-BR"/>
+        </w:rPr>
+        <w:t xml:space="preserve"> A solução é construir o seu backend como um conjunto de </w:t>
+      </w:r>
+      <w:r>
+        <w:rPr>
+          <w:rFonts w:ascii="Aptos" w:hAnsi="Aptos" w:eastAsia="Aptos" w:cs="Aptos"/>
+          <w:b w:val="1"/>
+          <w:bCs w:val="1"/>
+          <w:noProof w:val="0"/>
+          <w:sz w:val="24"/>
+          <w:szCs w:val="24"/>
+          <w:lang w:val="pt-BR"/>
+        </w:rPr>
+        <w:t>APIs REST</w:t>
+      </w:r>
+      <w:r>
+        <w:rPr>
+          <w:rFonts w:ascii="Aptos" w:hAnsi="Aptos" w:eastAsia="Aptos" w:cs="Aptos"/>
+          <w:noProof w:val="0"/>
+          <w:sz w:val="24"/>
+          <w:szCs w:val="24"/>
+          <w:lang w:val="pt-BR"/>
+        </w:rPr>
+        <w:t>. Todas as interações do front-end com o back-end (login, agendar consulta, acessar prontuário) serão feitas através de requisições HTTP para essas APIs, independentemente da plataforma.</w:t>
+      </w:r>
+    </w:p>
+    <w:p>
+      <w:pPr>
+        <w:pStyle w:val="PargrafodaLista"/>
+        <w:numPr>
+          <w:ilvl w:val="0"/>
+          <w:numId w:val="50"/>
+        </w:numPr>
+        <w:spacing w:before="240" w:beforeAutospacing="off" w:after="240" w:afterAutospacing="off"/>
+        <w:rPr>
+          <w:rFonts w:ascii="Aptos" w:hAnsi="Aptos" w:eastAsia="Aptos" w:cs="Aptos"/>
+          <w:noProof w:val="0"/>
+          <w:sz w:val="24"/>
+          <w:szCs w:val="24"/>
+          <w:lang w:val="pt-BR"/>
+        </w:rPr>
+      </w:pPr>
+      <w:r>
+        <w:rPr>
+          <w:rFonts w:ascii="Aptos" w:hAnsi="Aptos" w:eastAsia="Aptos" w:cs="Aptos"/>
+          <w:b w:val="1"/>
+          <w:bCs w:val="1"/>
+          <w:noProof w:val="0"/>
+          <w:sz w:val="24"/>
+          <w:szCs w:val="24"/>
+          <w:lang w:val="pt-BR"/>
+        </w:rPr>
+        <w:t>Mobile e Web:</w:t>
+      </w:r>
+      <w:r>
+        <w:rPr>
+          <w:rFonts w:ascii="Aptos" w:hAnsi="Aptos" w:eastAsia="Aptos" w:cs="Aptos"/>
+          <w:noProof w:val="0"/>
+          <w:sz w:val="24"/>
+          <w:szCs w:val="24"/>
+          <w:lang w:val="pt-BR"/>
+        </w:rPr>
+        <w:t xml:space="preserve"> Você terá um único back-end, mas o front-end web consumirá as APIs de um jeito (usando Javascript) e o front-end mobile consumirá as mesmas APIs de outro jeito (usando uma linguagem nativa como Kotlin/Swift, ou frameworks como React Native/Flutter).</w:t>
+      </w:r>
+    </w:p>
+    <w:p>
+      <w:pPr>
+        <w:pStyle w:val="PargrafodaLista"/>
+        <w:numPr>
+          <w:ilvl w:val="0"/>
+          <w:numId w:val="50"/>
+        </w:numPr>
+        <w:spacing w:before="240" w:beforeAutospacing="off" w:after="240" w:afterAutospacing="off"/>
+        <w:rPr>
+          <w:rFonts w:ascii="Aptos" w:hAnsi="Aptos" w:eastAsia="Aptos" w:cs="Aptos"/>
+          <w:noProof w:val="0"/>
+          <w:sz w:val="24"/>
+          <w:szCs w:val="24"/>
+          <w:lang w:val="pt-BR"/>
+        </w:rPr>
+      </w:pPr>
+      <w:r>
+        <w:rPr>
+          <w:rFonts w:ascii="Aptos" w:hAnsi="Aptos" w:eastAsia="Aptos" w:cs="Aptos"/>
+          <w:b w:val="1"/>
+          <w:bCs w:val="1"/>
+          <w:noProof w:val="0"/>
+          <w:sz w:val="24"/>
+          <w:szCs w:val="24"/>
+          <w:lang w:val="pt-BR"/>
+        </w:rPr>
+        <w:t>Docker:</w:t>
+      </w:r>
+      <w:r>
+        <w:rPr>
+          <w:rFonts w:ascii="Aptos" w:hAnsi="Aptos" w:eastAsia="Aptos" w:cs="Aptos"/>
+          <w:noProof w:val="0"/>
+          <w:sz w:val="24"/>
+          <w:szCs w:val="24"/>
+          <w:lang w:val="pt-BR"/>
+        </w:rPr>
+        <w:t xml:space="preserve"> Para a descentralização, usaremos </w:t>
+      </w:r>
+      <w:r>
+        <w:rPr>
+          <w:rFonts w:ascii="Aptos" w:hAnsi="Aptos" w:eastAsia="Aptos" w:cs="Aptos"/>
+          <w:b w:val="1"/>
+          <w:bCs w:val="1"/>
+          <w:noProof w:val="0"/>
+          <w:sz w:val="24"/>
+          <w:szCs w:val="24"/>
+          <w:lang w:val="pt-BR"/>
+        </w:rPr>
+        <w:t xml:space="preserve">Docker </w:t>
+      </w:r>
+      <w:r>
+        <w:rPr>
+          <w:rFonts w:ascii="Aptos" w:hAnsi="Aptos" w:eastAsia="Aptos" w:cs="Aptos"/>
+          <w:b w:val="1"/>
+          <w:bCs w:val="1"/>
+          <w:noProof w:val="0"/>
+          <w:sz w:val="24"/>
+          <w:szCs w:val="24"/>
+          <w:lang w:val="pt-BR"/>
+        </w:rPr>
+        <w:t>Compose</w:t>
+      </w:r>
+      <w:r>
+        <w:rPr>
+          <w:rFonts w:ascii="Aptos" w:hAnsi="Aptos" w:eastAsia="Aptos" w:cs="Aptos"/>
+          <w:noProof w:val="0"/>
+          <w:sz w:val="24"/>
+          <w:szCs w:val="24"/>
+          <w:lang w:val="pt-BR"/>
+        </w:rPr>
+        <w:t xml:space="preserve"> para orquestrar os contêineres do monolito, do microsserviço de autenticação e dos bancos de dados (PostgreSQL e </w:t>
+      </w:r>
+      <w:r>
+        <w:rPr>
+          <w:rFonts w:ascii="Aptos" w:hAnsi="Aptos" w:eastAsia="Aptos" w:cs="Aptos"/>
+          <w:noProof w:val="0"/>
+          <w:sz w:val="24"/>
+          <w:szCs w:val="24"/>
+          <w:lang w:val="pt-BR"/>
+        </w:rPr>
+        <w:t>MongoDB</w:t>
+      </w:r>
+      <w:r>
+        <w:rPr>
+          <w:rFonts w:ascii="Aptos" w:hAnsi="Aptos" w:eastAsia="Aptos" w:cs="Aptos"/>
+          <w:noProof w:val="0"/>
+          <w:sz w:val="24"/>
+          <w:szCs w:val="24"/>
+          <w:lang w:val="pt-BR"/>
+        </w:rPr>
+        <w:t>). Isso é perfeito para o seu ambiente de servidor com IP fixo.</w:t>
+      </w:r>
+    </w:p>
+    <w:p>
+      <w:pPr>
+        <w:pStyle w:val="Normal"/>
+        <w:spacing w:before="240" w:beforeAutospacing="off" w:after="240" w:afterAutospacing="off"/>
+        <w:rPr>
+          <w:rFonts w:ascii="Aptos" w:hAnsi="Aptos" w:eastAsia="Aptos" w:cs="Aptos"/>
+          <w:noProof w:val="0"/>
+          <w:sz w:val="24"/>
+          <w:szCs w:val="24"/>
+          <w:lang w:val="pt-BR"/>
+        </w:rPr>
+      </w:pPr>
+    </w:p>
+    <w:p>
+      <w:pPr>
+        <w:pStyle w:val="Ttulo2"/>
+        <w:rPr>
+          <w:rFonts w:ascii="Aptos" w:hAnsi="Aptos" w:eastAsia="Aptos" w:cs="Aptos"/>
+          <w:noProof w:val="0"/>
+          <w:sz w:val="24"/>
+          <w:szCs w:val="24"/>
+          <w:lang w:val="pt-BR"/>
+        </w:rPr>
+      </w:pPr>
+      <w:r>
+        <w:rPr>
+          <w:noProof w:val="0"/>
+          <w:lang w:val="pt-BR"/>
+        </w:rPr>
+        <w:t>API REST</w:t>
+      </w:r>
+    </w:p>
+    <w:p>
+      <w:pPr>
+        <w:pStyle w:val="Ttulo3"/>
+        <w:spacing w:before="0" w:beforeAutospacing="off" w:after="281" w:afterAutospacing="off"/>
+      </w:pPr>
+      <w:r>
+        <w:rPr>
+          <w:rFonts w:ascii="Aptos" w:hAnsi="Aptos" w:eastAsia="Aptos" w:cs="Aptos"/>
+          <w:noProof w:val="0"/>
+          <w:sz w:val="24"/>
+          <w:szCs w:val="24"/>
+          <w:lang w:val="pt-BR"/>
+        </w:rPr>
+        <w:t>API REST do Monolito (Backend Web/Mobile)</w:t>
+      </w:r>
+    </w:p>
+    <w:p>
+      <w:pPr>
+        <w:spacing w:before="240" w:beforeAutospacing="off" w:after="240" w:afterAutospacing="off"/>
+      </w:pPr>
+      <w:r>
+        <w:rPr>
+          <w:rFonts w:ascii="Aptos" w:hAnsi="Aptos" w:eastAsia="Aptos" w:cs="Aptos"/>
+          <w:noProof w:val="0"/>
+          <w:sz w:val="24"/>
+          <w:szCs w:val="24"/>
+          <w:lang w:val="pt-BR"/>
+        </w:rPr>
+        <w:t>A API do monolito será a porta de entrada para a maioria das funcionalidades do sistema, como gestão de pacientes e agendamentos. Usaremos os verbos HTTP (GET, POST, PUT, DELETE) para representar as operações.</w:t>
+      </w:r>
+    </w:p>
+    <w:p>
+      <w:pPr>
+        <w:pStyle w:val="Ttulo4"/>
+      </w:pPr>
+      <w:r>
+        <w:rPr>
+          <w:noProof w:val="0"/>
+          <w:lang w:val="pt-BR"/>
+        </w:rPr>
+        <w:t>1. Módulo de Pacientes</w:t>
+      </w:r>
+    </w:p>
+    <w:p>
+      <w:pPr>
+        <w:pStyle w:val="PargrafodaLista"/>
+        <w:numPr>
+          <w:ilvl w:val="0"/>
+          <w:numId w:val="51"/>
+        </w:numPr>
+        <w:spacing w:before="240" w:beforeAutospacing="off" w:after="240" w:afterAutospacing="off"/>
+        <w:rPr>
+          <w:rFonts w:ascii="Aptos" w:hAnsi="Aptos" w:eastAsia="Aptos" w:cs="Aptos"/>
+          <w:noProof w:val="0"/>
+          <w:sz w:val="24"/>
+          <w:szCs w:val="24"/>
+          <w:lang w:val="pt-BR"/>
+        </w:rPr>
+      </w:pPr>
+      <w:r>
+        <w:rPr>
+          <w:rFonts w:ascii="Aptos" w:hAnsi="Aptos" w:eastAsia="Aptos" w:cs="Aptos"/>
+          <w:noProof w:val="0"/>
+          <w:sz w:val="24"/>
+          <w:szCs w:val="24"/>
+          <w:lang w:val="pt-BR"/>
+        </w:rPr>
+        <w:t>[GET] /api/patients/</w:t>
+      </w:r>
+    </w:p>
+    <w:p>
+      <w:pPr>
+        <w:pStyle w:val="PargrafodaLista"/>
+        <w:numPr>
+          <w:ilvl w:val="1"/>
+          <w:numId w:val="51"/>
+        </w:numPr>
+        <w:spacing w:before="240" w:beforeAutospacing="off" w:after="240" w:afterAutospacing="off"/>
+        <w:rPr>
+          <w:rFonts w:ascii="Aptos" w:hAnsi="Aptos" w:eastAsia="Aptos" w:cs="Aptos"/>
+          <w:noProof w:val="0"/>
+          <w:sz w:val="24"/>
+          <w:szCs w:val="24"/>
+          <w:lang w:val="pt-BR"/>
+        </w:rPr>
+      </w:pPr>
+      <w:r>
+        <w:rPr>
+          <w:rFonts w:ascii="Aptos" w:hAnsi="Aptos" w:eastAsia="Aptos" w:cs="Aptos"/>
+          <w:b w:val="1"/>
+          <w:bCs w:val="1"/>
+          <w:noProof w:val="0"/>
+          <w:sz w:val="24"/>
+          <w:szCs w:val="24"/>
+          <w:lang w:val="pt-BR"/>
+        </w:rPr>
+        <w:t>Função:</w:t>
+      </w:r>
+      <w:r>
+        <w:rPr>
+          <w:rFonts w:ascii="Aptos" w:hAnsi="Aptos" w:eastAsia="Aptos" w:cs="Aptos"/>
+          <w:noProof w:val="0"/>
+          <w:sz w:val="24"/>
+          <w:szCs w:val="24"/>
+          <w:lang w:val="pt-BR"/>
+        </w:rPr>
+        <w:t xml:space="preserve"> Lista todos os pacientes (acesso restrito a profissionais/administradores).</w:t>
+      </w:r>
+    </w:p>
+    <w:p>
+      <w:pPr>
+        <w:pStyle w:val="PargrafodaLista"/>
+        <w:numPr>
+          <w:ilvl w:val="1"/>
+          <w:numId w:val="51"/>
+        </w:numPr>
+        <w:spacing w:before="240" w:beforeAutospacing="off" w:after="240" w:afterAutospacing="off"/>
+        <w:rPr>
+          <w:rFonts w:ascii="Aptos" w:hAnsi="Aptos" w:eastAsia="Aptos" w:cs="Aptos"/>
+          <w:noProof w:val="0"/>
+          <w:sz w:val="24"/>
+          <w:szCs w:val="24"/>
+          <w:lang w:val="pt-BR"/>
+        </w:rPr>
+      </w:pPr>
+      <w:r>
+        <w:rPr>
+          <w:rFonts w:ascii="Aptos" w:hAnsi="Aptos" w:eastAsia="Aptos" w:cs="Aptos"/>
+          <w:b w:val="1"/>
+          <w:bCs w:val="1"/>
+          <w:noProof w:val="0"/>
+          <w:sz w:val="24"/>
+          <w:szCs w:val="24"/>
+          <w:lang w:val="pt-BR"/>
+        </w:rPr>
+        <w:t>Resposta:</w:t>
+      </w:r>
+      <w:r>
+        <w:rPr>
+          <w:rFonts w:ascii="Aptos" w:hAnsi="Aptos" w:eastAsia="Aptos" w:cs="Aptos"/>
+          <w:noProof w:val="0"/>
+          <w:sz w:val="24"/>
+          <w:szCs w:val="24"/>
+          <w:lang w:val="pt-BR"/>
+        </w:rPr>
+        <w:t xml:space="preserve"> Array de objetos de paciente.</w:t>
+      </w:r>
+    </w:p>
+    <w:p>
+      <w:pPr>
+        <w:pStyle w:val="PargrafodaLista"/>
+        <w:numPr>
+          <w:ilvl w:val="0"/>
+          <w:numId w:val="51"/>
+        </w:numPr>
+        <w:spacing w:before="240" w:beforeAutospacing="off" w:after="240" w:afterAutospacing="off"/>
+        <w:rPr>
+          <w:rFonts w:ascii="Aptos" w:hAnsi="Aptos" w:eastAsia="Aptos" w:cs="Aptos"/>
+          <w:noProof w:val="0"/>
+          <w:sz w:val="24"/>
+          <w:szCs w:val="24"/>
+          <w:lang w:val="pt-BR"/>
+        </w:rPr>
+      </w:pPr>
+      <w:r>
+        <w:rPr>
+          <w:rFonts w:ascii="Aptos" w:hAnsi="Aptos" w:eastAsia="Aptos" w:cs="Aptos"/>
+          <w:noProof w:val="0"/>
+          <w:sz w:val="24"/>
+          <w:szCs w:val="24"/>
+          <w:lang w:val="pt-BR"/>
+        </w:rPr>
+        <w:t>[POST] /api/patients/</w:t>
+      </w:r>
+    </w:p>
+    <w:p>
+      <w:pPr>
+        <w:pStyle w:val="PargrafodaLista"/>
+        <w:numPr>
+          <w:ilvl w:val="1"/>
+          <w:numId w:val="51"/>
+        </w:numPr>
+        <w:spacing w:before="240" w:beforeAutospacing="off" w:after="240" w:afterAutospacing="off"/>
+        <w:rPr>
+          <w:rFonts w:ascii="Aptos" w:hAnsi="Aptos" w:eastAsia="Aptos" w:cs="Aptos"/>
+          <w:noProof w:val="0"/>
+          <w:sz w:val="24"/>
+          <w:szCs w:val="24"/>
+          <w:lang w:val="pt-BR"/>
+        </w:rPr>
+      </w:pPr>
+      <w:r>
+        <w:rPr>
+          <w:rFonts w:ascii="Aptos" w:hAnsi="Aptos" w:eastAsia="Aptos" w:cs="Aptos"/>
+          <w:b w:val="1"/>
+          <w:bCs w:val="1"/>
+          <w:noProof w:val="0"/>
+          <w:sz w:val="24"/>
+          <w:szCs w:val="24"/>
+          <w:lang w:val="pt-BR"/>
+        </w:rPr>
+        <w:t>Função:</w:t>
+      </w:r>
+      <w:r>
+        <w:rPr>
+          <w:rFonts w:ascii="Aptos" w:hAnsi="Aptos" w:eastAsia="Aptos" w:cs="Aptos"/>
+          <w:noProof w:val="0"/>
+          <w:sz w:val="24"/>
+          <w:szCs w:val="24"/>
+          <w:lang w:val="pt-BR"/>
+        </w:rPr>
+        <w:t xml:space="preserve"> Cadastra um novo paciente.</w:t>
+      </w:r>
+    </w:p>
+    <w:p>
+      <w:pPr>
+        <w:pStyle w:val="PargrafodaLista"/>
+        <w:numPr>
+          <w:ilvl w:val="1"/>
+          <w:numId w:val="51"/>
+        </w:numPr>
+        <w:spacing w:before="240" w:beforeAutospacing="off" w:after="240" w:afterAutospacing="off"/>
+        <w:rPr>
+          <w:rFonts w:ascii="Aptos" w:hAnsi="Aptos" w:eastAsia="Aptos" w:cs="Aptos"/>
+          <w:noProof w:val="0"/>
+          <w:sz w:val="24"/>
+          <w:szCs w:val="24"/>
+          <w:lang w:val="pt-BR"/>
+        </w:rPr>
+      </w:pPr>
+      <w:r>
+        <w:rPr>
+          <w:rFonts w:ascii="Aptos" w:hAnsi="Aptos" w:eastAsia="Aptos" w:cs="Aptos"/>
+          <w:b w:val="1"/>
+          <w:bCs w:val="1"/>
+          <w:noProof w:val="0"/>
+          <w:sz w:val="24"/>
+          <w:szCs w:val="24"/>
+          <w:lang w:val="pt-BR"/>
+        </w:rPr>
+        <w:t>Corpo da requisição:</w:t>
+      </w:r>
+      <w:r>
+        <w:rPr>
+          <w:rFonts w:ascii="Aptos" w:hAnsi="Aptos" w:eastAsia="Aptos" w:cs="Aptos"/>
+          <w:noProof w:val="0"/>
+          <w:sz w:val="24"/>
+          <w:szCs w:val="24"/>
+          <w:lang w:val="pt-BR"/>
+        </w:rPr>
+        <w:t xml:space="preserve"> Dados do paciente (nome, CPF, etc.).</w:t>
+      </w:r>
+    </w:p>
+    <w:p>
+      <w:pPr>
+        <w:pStyle w:val="PargrafodaLista"/>
+        <w:numPr>
+          <w:ilvl w:val="1"/>
+          <w:numId w:val="51"/>
+        </w:numPr>
+        <w:spacing w:before="240" w:beforeAutospacing="off" w:after="240" w:afterAutospacing="off"/>
+        <w:rPr>
+          <w:rFonts w:ascii="Aptos" w:hAnsi="Aptos" w:eastAsia="Aptos" w:cs="Aptos"/>
+          <w:noProof w:val="0"/>
+          <w:sz w:val="24"/>
+          <w:szCs w:val="24"/>
+          <w:lang w:val="pt-BR"/>
+        </w:rPr>
+      </w:pPr>
+      <w:r>
+        <w:rPr>
+          <w:rFonts w:ascii="Aptos" w:hAnsi="Aptos" w:eastAsia="Aptos" w:cs="Aptos"/>
+          <w:b w:val="1"/>
+          <w:bCs w:val="1"/>
+          <w:noProof w:val="0"/>
+          <w:sz w:val="24"/>
+          <w:szCs w:val="24"/>
+          <w:lang w:val="pt-BR"/>
+        </w:rPr>
+        <w:t>Resposta:</w:t>
+      </w:r>
+      <w:r>
+        <w:rPr>
+          <w:rFonts w:ascii="Aptos" w:hAnsi="Aptos" w:eastAsia="Aptos" w:cs="Aptos"/>
+          <w:noProof w:val="0"/>
+          <w:sz w:val="24"/>
+          <w:szCs w:val="24"/>
+          <w:lang w:val="pt-BR"/>
+        </w:rPr>
+        <w:t xml:space="preserve"> Objeto do paciente recém-criado.</w:t>
+      </w:r>
+    </w:p>
+    <w:p>
+      <w:pPr>
+        <w:pStyle w:val="PargrafodaLista"/>
+        <w:numPr>
+          <w:ilvl w:val="0"/>
+          <w:numId w:val="51"/>
+        </w:numPr>
+        <w:spacing w:before="240" w:beforeAutospacing="off" w:after="240" w:afterAutospacing="off"/>
+        <w:rPr>
+          <w:rFonts w:ascii="Aptos" w:hAnsi="Aptos" w:eastAsia="Aptos" w:cs="Aptos"/>
+          <w:noProof w:val="0"/>
+          <w:sz w:val="24"/>
+          <w:szCs w:val="24"/>
+          <w:lang w:val="pt-BR"/>
+        </w:rPr>
+      </w:pPr>
+      <w:r>
+        <w:rPr>
+          <w:rFonts w:ascii="Aptos" w:hAnsi="Aptos" w:eastAsia="Aptos" w:cs="Aptos"/>
+          <w:noProof w:val="0"/>
+          <w:sz w:val="24"/>
+          <w:szCs w:val="24"/>
+          <w:lang w:val="pt-BR"/>
+        </w:rPr>
+        <w:t>[GET] /api/patients/{id}/</w:t>
+      </w:r>
+    </w:p>
+    <w:p>
+      <w:pPr>
+        <w:pStyle w:val="PargrafodaLista"/>
+        <w:numPr>
+          <w:ilvl w:val="1"/>
+          <w:numId w:val="51"/>
+        </w:numPr>
+        <w:spacing w:before="240" w:beforeAutospacing="off" w:after="240" w:afterAutospacing="off"/>
+        <w:rPr>
+          <w:rFonts w:ascii="Aptos" w:hAnsi="Aptos" w:eastAsia="Aptos" w:cs="Aptos"/>
+          <w:noProof w:val="0"/>
+          <w:sz w:val="24"/>
+          <w:szCs w:val="24"/>
+          <w:lang w:val="pt-BR"/>
+        </w:rPr>
+      </w:pPr>
+      <w:r>
+        <w:rPr>
+          <w:rFonts w:ascii="Aptos" w:hAnsi="Aptos" w:eastAsia="Aptos" w:cs="Aptos"/>
+          <w:b w:val="1"/>
+          <w:bCs w:val="1"/>
+          <w:noProof w:val="0"/>
+          <w:sz w:val="24"/>
+          <w:szCs w:val="24"/>
+          <w:lang w:val="pt-BR"/>
+        </w:rPr>
+        <w:t>Função:</w:t>
+      </w:r>
+      <w:r>
+        <w:rPr>
+          <w:rFonts w:ascii="Aptos" w:hAnsi="Aptos" w:eastAsia="Aptos" w:cs="Aptos"/>
+          <w:noProof w:val="0"/>
+          <w:sz w:val="24"/>
+          <w:szCs w:val="24"/>
+          <w:lang w:val="pt-BR"/>
+        </w:rPr>
+        <w:t xml:space="preserve"> Retorna os dados de um paciente específico.</w:t>
+      </w:r>
+    </w:p>
+    <w:p>
+      <w:pPr>
+        <w:pStyle w:val="PargrafodaLista"/>
+        <w:numPr>
+          <w:ilvl w:val="0"/>
+          <w:numId w:val="51"/>
+        </w:numPr>
+        <w:spacing w:before="240" w:beforeAutospacing="off" w:after="240" w:afterAutospacing="off"/>
+        <w:rPr>
+          <w:rFonts w:ascii="Aptos" w:hAnsi="Aptos" w:eastAsia="Aptos" w:cs="Aptos"/>
+          <w:noProof w:val="0"/>
+          <w:sz w:val="24"/>
+          <w:szCs w:val="24"/>
+          <w:lang w:val="pt-BR"/>
+        </w:rPr>
+      </w:pPr>
+      <w:r>
+        <w:rPr>
+          <w:rFonts w:ascii="Aptos" w:hAnsi="Aptos" w:eastAsia="Aptos" w:cs="Aptos"/>
+          <w:noProof w:val="0"/>
+          <w:sz w:val="24"/>
+          <w:szCs w:val="24"/>
+          <w:lang w:val="pt-BR"/>
+        </w:rPr>
+        <w:t>[PUT] /api/patients/{id}/</w:t>
+      </w:r>
+    </w:p>
+    <w:p>
+      <w:pPr>
+        <w:pStyle w:val="PargrafodaLista"/>
+        <w:numPr>
+          <w:ilvl w:val="1"/>
+          <w:numId w:val="51"/>
+        </w:numPr>
+        <w:spacing w:before="240" w:beforeAutospacing="off" w:after="240" w:afterAutospacing="off"/>
+        <w:rPr>
+          <w:rFonts w:ascii="Aptos" w:hAnsi="Aptos" w:eastAsia="Aptos" w:cs="Aptos"/>
+          <w:noProof w:val="0"/>
+          <w:sz w:val="24"/>
+          <w:szCs w:val="24"/>
+          <w:lang w:val="pt-BR"/>
+        </w:rPr>
+      </w:pPr>
+      <w:r>
+        <w:rPr>
+          <w:rFonts w:ascii="Aptos" w:hAnsi="Aptos" w:eastAsia="Aptos" w:cs="Aptos"/>
+          <w:b w:val="1"/>
+          <w:bCs w:val="1"/>
+          <w:noProof w:val="0"/>
+          <w:sz w:val="24"/>
+          <w:szCs w:val="24"/>
+          <w:lang w:val="pt-BR"/>
+        </w:rPr>
+        <w:t>Função:</w:t>
+      </w:r>
+      <w:r>
+        <w:rPr>
+          <w:rFonts w:ascii="Aptos" w:hAnsi="Aptos" w:eastAsia="Aptos" w:cs="Aptos"/>
+          <w:noProof w:val="0"/>
+          <w:sz w:val="24"/>
+          <w:szCs w:val="24"/>
+          <w:lang w:val="pt-BR"/>
+        </w:rPr>
+        <w:t xml:space="preserve"> Atualiza os dados de um paciente.</w:t>
+      </w:r>
+    </w:p>
+    <w:p>
+      <w:pPr>
+        <w:pStyle w:val="PargrafodaLista"/>
+        <w:numPr>
+          <w:ilvl w:val="0"/>
+          <w:numId w:val="51"/>
+        </w:numPr>
+        <w:spacing w:before="240" w:beforeAutospacing="off" w:after="240" w:afterAutospacing="off"/>
+        <w:rPr>
+          <w:rFonts w:ascii="Aptos" w:hAnsi="Aptos" w:eastAsia="Aptos" w:cs="Aptos"/>
+          <w:noProof w:val="0"/>
+          <w:sz w:val="24"/>
+          <w:szCs w:val="24"/>
+          <w:lang w:val="pt-BR"/>
+        </w:rPr>
+      </w:pPr>
+      <w:r>
+        <w:rPr>
+          <w:rFonts w:ascii="Aptos" w:hAnsi="Aptos" w:eastAsia="Aptos" w:cs="Aptos"/>
+          <w:noProof w:val="0"/>
+          <w:sz w:val="24"/>
+          <w:szCs w:val="24"/>
+          <w:lang w:val="pt-BR"/>
+        </w:rPr>
+        <w:t>[DELETE] /api/patients/{id}/</w:t>
+      </w:r>
+    </w:p>
+    <w:p>
+      <w:pPr>
+        <w:pStyle w:val="PargrafodaLista"/>
+        <w:numPr>
+          <w:ilvl w:val="1"/>
+          <w:numId w:val="51"/>
+        </w:numPr>
+        <w:spacing w:before="240" w:beforeAutospacing="off" w:after="240" w:afterAutospacing="off"/>
+        <w:rPr>
+          <w:rFonts w:ascii="Aptos" w:hAnsi="Aptos" w:eastAsia="Aptos" w:cs="Aptos"/>
+          <w:noProof w:val="0"/>
+          <w:sz w:val="24"/>
+          <w:szCs w:val="24"/>
+          <w:lang w:val="pt-BR"/>
+        </w:rPr>
+      </w:pPr>
+      <w:r>
+        <w:rPr>
+          <w:rFonts w:ascii="Aptos" w:hAnsi="Aptos" w:eastAsia="Aptos" w:cs="Aptos"/>
+          <w:b w:val="1"/>
+          <w:bCs w:val="1"/>
+          <w:noProof w:val="0"/>
+          <w:sz w:val="24"/>
+          <w:szCs w:val="24"/>
+          <w:lang w:val="pt-BR"/>
+        </w:rPr>
+        <w:t>Função:</w:t>
+      </w:r>
+      <w:r>
+        <w:rPr>
+          <w:rFonts w:ascii="Aptos" w:hAnsi="Aptos" w:eastAsia="Aptos" w:cs="Aptos"/>
+          <w:noProof w:val="0"/>
+          <w:sz w:val="24"/>
+          <w:szCs w:val="24"/>
+          <w:lang w:val="pt-BR"/>
+        </w:rPr>
+        <w:t xml:space="preserve"> Remove um paciente.</w:t>
+      </w:r>
+    </w:p>
+    <w:p>
+      <w:pPr>
+        <w:pStyle w:val="Ttulo4"/>
+      </w:pPr>
+      <w:r>
+        <w:rPr>
+          <w:noProof w:val="0"/>
+          <w:lang w:val="pt-BR"/>
+        </w:rPr>
+        <w:t>2. Módulo de Agendamentos</w:t>
+      </w:r>
+    </w:p>
+    <w:p>
+      <w:pPr>
+        <w:pStyle w:val="PargrafodaLista"/>
+        <w:numPr>
+          <w:ilvl w:val="0"/>
+          <w:numId w:val="52"/>
+        </w:numPr>
+        <w:spacing w:before="240" w:beforeAutospacing="off" w:after="240" w:afterAutospacing="off"/>
+        <w:rPr>
+          <w:rFonts w:ascii="Aptos" w:hAnsi="Aptos" w:eastAsia="Aptos" w:cs="Aptos"/>
+          <w:noProof w:val="0"/>
+          <w:sz w:val="24"/>
+          <w:szCs w:val="24"/>
+          <w:lang w:val="pt-BR"/>
+        </w:rPr>
+      </w:pPr>
+      <w:r>
+        <w:rPr>
+          <w:rFonts w:ascii="Aptos" w:hAnsi="Aptos" w:eastAsia="Aptos" w:cs="Aptos"/>
+          <w:noProof w:val="0"/>
+          <w:sz w:val="24"/>
+          <w:szCs w:val="24"/>
+          <w:lang w:val="pt-BR"/>
+        </w:rPr>
+        <w:t>[GET] /api/appointments/</w:t>
+      </w:r>
+    </w:p>
+    <w:p>
+      <w:pPr>
+        <w:pStyle w:val="PargrafodaLista"/>
+        <w:numPr>
+          <w:ilvl w:val="1"/>
+          <w:numId w:val="52"/>
+        </w:numPr>
+        <w:spacing w:before="240" w:beforeAutospacing="off" w:after="240" w:afterAutospacing="off"/>
+        <w:rPr>
+          <w:rFonts w:ascii="Aptos" w:hAnsi="Aptos" w:eastAsia="Aptos" w:cs="Aptos"/>
+          <w:noProof w:val="0"/>
+          <w:sz w:val="24"/>
+          <w:szCs w:val="24"/>
+          <w:lang w:val="pt-BR"/>
+        </w:rPr>
+      </w:pPr>
+      <w:r>
+        <w:rPr>
+          <w:rFonts w:ascii="Aptos" w:hAnsi="Aptos" w:eastAsia="Aptos" w:cs="Aptos"/>
+          <w:b w:val="1"/>
+          <w:bCs w:val="1"/>
+          <w:noProof w:val="0"/>
+          <w:sz w:val="24"/>
+          <w:szCs w:val="24"/>
+          <w:lang w:val="pt-BR"/>
+        </w:rPr>
+        <w:t>Função:</w:t>
+      </w:r>
+      <w:r>
+        <w:rPr>
+          <w:rFonts w:ascii="Aptos" w:hAnsi="Aptos" w:eastAsia="Aptos" w:cs="Aptos"/>
+          <w:noProof w:val="0"/>
+          <w:sz w:val="24"/>
+          <w:szCs w:val="24"/>
+          <w:lang w:val="pt-BR"/>
+        </w:rPr>
+        <w:t xml:space="preserve"> Lista todos os agendamentos.</w:t>
+      </w:r>
+    </w:p>
+    <w:p>
+      <w:pPr>
+        <w:pStyle w:val="PargrafodaLista"/>
+        <w:numPr>
+          <w:ilvl w:val="0"/>
+          <w:numId w:val="52"/>
+        </w:numPr>
+        <w:spacing w:before="240" w:beforeAutospacing="off" w:after="240" w:afterAutospacing="off"/>
+        <w:rPr>
+          <w:rFonts w:ascii="Aptos" w:hAnsi="Aptos" w:eastAsia="Aptos" w:cs="Aptos"/>
+          <w:noProof w:val="0"/>
+          <w:sz w:val="24"/>
+          <w:szCs w:val="24"/>
+          <w:lang w:val="pt-BR"/>
+        </w:rPr>
+      </w:pPr>
+      <w:r>
+        <w:rPr>
+          <w:rFonts w:ascii="Aptos" w:hAnsi="Aptos" w:eastAsia="Aptos" w:cs="Aptos"/>
+          <w:noProof w:val="0"/>
+          <w:sz w:val="24"/>
+          <w:szCs w:val="24"/>
+          <w:lang w:val="pt-BR"/>
+        </w:rPr>
+        <w:t>[POST] /api/appointments/</w:t>
+      </w:r>
+    </w:p>
+    <w:p>
+      <w:pPr>
+        <w:pStyle w:val="PargrafodaLista"/>
+        <w:numPr>
+          <w:ilvl w:val="1"/>
+          <w:numId w:val="52"/>
+        </w:numPr>
+        <w:spacing w:before="240" w:beforeAutospacing="off" w:after="240" w:afterAutospacing="off"/>
+        <w:rPr>
+          <w:rFonts w:ascii="Aptos" w:hAnsi="Aptos" w:eastAsia="Aptos" w:cs="Aptos"/>
+          <w:noProof w:val="0"/>
+          <w:sz w:val="24"/>
+          <w:szCs w:val="24"/>
+          <w:lang w:val="pt-BR"/>
+        </w:rPr>
+      </w:pPr>
+      <w:r>
+        <w:rPr>
+          <w:rFonts w:ascii="Aptos" w:hAnsi="Aptos" w:eastAsia="Aptos" w:cs="Aptos"/>
+          <w:b w:val="1"/>
+          <w:bCs w:val="1"/>
+          <w:noProof w:val="0"/>
+          <w:sz w:val="24"/>
+          <w:szCs w:val="24"/>
+          <w:lang w:val="pt-BR"/>
+        </w:rPr>
+        <w:t>Função:</w:t>
+      </w:r>
+      <w:r>
+        <w:rPr>
+          <w:rFonts w:ascii="Aptos" w:hAnsi="Aptos" w:eastAsia="Aptos" w:cs="Aptos"/>
+          <w:noProof w:val="0"/>
+          <w:sz w:val="24"/>
+          <w:szCs w:val="24"/>
+          <w:lang w:val="pt-BR"/>
+        </w:rPr>
+        <w:t xml:space="preserve"> Cria um novo agendamento.</w:t>
+      </w:r>
+    </w:p>
+    <w:p>
+      <w:pPr>
+        <w:pStyle w:val="PargrafodaLista"/>
+        <w:numPr>
+          <w:ilvl w:val="0"/>
+          <w:numId w:val="52"/>
+        </w:numPr>
+        <w:spacing w:before="240" w:beforeAutospacing="off" w:after="240" w:afterAutospacing="off"/>
+        <w:rPr>
+          <w:rFonts w:ascii="Aptos" w:hAnsi="Aptos" w:eastAsia="Aptos" w:cs="Aptos"/>
+          <w:noProof w:val="0"/>
+          <w:sz w:val="24"/>
+          <w:szCs w:val="24"/>
+          <w:lang w:val="pt-BR"/>
+        </w:rPr>
+      </w:pPr>
+      <w:r>
+        <w:rPr>
+          <w:rFonts w:ascii="Aptos" w:hAnsi="Aptos" w:eastAsia="Aptos" w:cs="Aptos"/>
+          <w:noProof w:val="0"/>
+          <w:sz w:val="24"/>
+          <w:szCs w:val="24"/>
+          <w:lang w:val="pt-BR"/>
+        </w:rPr>
+        <w:t>[GET] /api/appointments/{id}/</w:t>
+      </w:r>
+    </w:p>
+    <w:p>
+      <w:pPr>
+        <w:pStyle w:val="PargrafodaLista"/>
+        <w:numPr>
+          <w:ilvl w:val="1"/>
+          <w:numId w:val="52"/>
+        </w:numPr>
+        <w:spacing w:before="240" w:beforeAutospacing="off" w:after="240" w:afterAutospacing="off"/>
+        <w:rPr>
+          <w:rFonts w:ascii="Aptos" w:hAnsi="Aptos" w:eastAsia="Aptos" w:cs="Aptos"/>
+          <w:noProof w:val="0"/>
+          <w:sz w:val="24"/>
+          <w:szCs w:val="24"/>
+          <w:lang w:val="pt-BR"/>
+        </w:rPr>
+      </w:pPr>
+      <w:r>
+        <w:rPr>
+          <w:rFonts w:ascii="Aptos" w:hAnsi="Aptos" w:eastAsia="Aptos" w:cs="Aptos"/>
+          <w:b w:val="1"/>
+          <w:bCs w:val="1"/>
+          <w:noProof w:val="0"/>
+          <w:sz w:val="24"/>
+          <w:szCs w:val="24"/>
+          <w:lang w:val="pt-BR"/>
+        </w:rPr>
+        <w:t>Função:</w:t>
+      </w:r>
+      <w:r>
+        <w:rPr>
+          <w:rFonts w:ascii="Aptos" w:hAnsi="Aptos" w:eastAsia="Aptos" w:cs="Aptos"/>
+          <w:noProof w:val="0"/>
+          <w:sz w:val="24"/>
+          <w:szCs w:val="24"/>
+          <w:lang w:val="pt-BR"/>
+        </w:rPr>
+        <w:t xml:space="preserve"> Retorna um agendamento específico.</w:t>
+      </w:r>
+    </w:p>
+    <w:p>
+      <w:pPr>
+        <w:pStyle w:val="PargrafodaLista"/>
+        <w:numPr>
+          <w:ilvl w:val="0"/>
+          <w:numId w:val="52"/>
+        </w:numPr>
+        <w:spacing w:before="240" w:beforeAutospacing="off" w:after="240" w:afterAutospacing="off"/>
+        <w:rPr>
+          <w:rFonts w:ascii="Aptos" w:hAnsi="Aptos" w:eastAsia="Aptos" w:cs="Aptos"/>
+          <w:noProof w:val="0"/>
+          <w:sz w:val="24"/>
+          <w:szCs w:val="24"/>
+          <w:lang w:val="pt-BR"/>
+        </w:rPr>
+      </w:pPr>
+      <w:r>
+        <w:rPr>
+          <w:rFonts w:ascii="Aptos" w:hAnsi="Aptos" w:eastAsia="Aptos" w:cs="Aptos"/>
+          <w:noProof w:val="0"/>
+          <w:sz w:val="24"/>
+          <w:szCs w:val="24"/>
+          <w:lang w:val="pt-BR"/>
+        </w:rPr>
+        <w:t>[PUT] /api/appointments/{id}/</w:t>
+      </w:r>
+    </w:p>
+    <w:p>
+      <w:pPr>
+        <w:pStyle w:val="PargrafodaLista"/>
+        <w:numPr>
+          <w:ilvl w:val="1"/>
+          <w:numId w:val="52"/>
+        </w:numPr>
+        <w:spacing w:before="240" w:beforeAutospacing="off" w:after="240" w:afterAutospacing="off"/>
+        <w:rPr>
+          <w:rFonts w:ascii="Aptos" w:hAnsi="Aptos" w:eastAsia="Aptos" w:cs="Aptos"/>
+          <w:noProof w:val="0"/>
+          <w:sz w:val="24"/>
+          <w:szCs w:val="24"/>
+          <w:lang w:val="pt-BR"/>
+        </w:rPr>
+      </w:pPr>
+      <w:r>
+        <w:rPr>
+          <w:rFonts w:ascii="Aptos" w:hAnsi="Aptos" w:eastAsia="Aptos" w:cs="Aptos"/>
+          <w:b w:val="1"/>
+          <w:bCs w:val="1"/>
+          <w:noProof w:val="0"/>
+          <w:sz w:val="24"/>
+          <w:szCs w:val="24"/>
+          <w:lang w:val="pt-BR"/>
+        </w:rPr>
+        <w:t>Função:</w:t>
+      </w:r>
+      <w:r>
+        <w:rPr>
+          <w:rFonts w:ascii="Aptos" w:hAnsi="Aptos" w:eastAsia="Aptos" w:cs="Aptos"/>
+          <w:noProof w:val="0"/>
+          <w:sz w:val="24"/>
+          <w:szCs w:val="24"/>
+          <w:lang w:val="pt-BR"/>
+        </w:rPr>
+        <w:t xml:space="preserve"> Atualiza um agendamento (ex: muda o status).</w:t>
+      </w:r>
+    </w:p>
+    <w:p/>
+    <w:p>
+      <w:pPr>
+        <w:pStyle w:val="Ttulo3"/>
+        <w:spacing w:before="281" w:beforeAutospacing="off" w:after="281" w:afterAutospacing="off"/>
+      </w:pPr>
+      <w:r>
+        <w:rPr>
+          <w:rFonts w:ascii="Aptos" w:hAnsi="Aptos" w:eastAsia="Aptos" w:cs="Aptos"/>
+          <w:noProof w:val="0"/>
+          <w:sz w:val="24"/>
+          <w:szCs w:val="24"/>
+          <w:lang w:val="pt-BR"/>
+        </w:rPr>
+        <w:t>API REST do Microsserviço de Autenticação</w:t>
+      </w:r>
+    </w:p>
+    <w:p>
+      <w:pPr>
+        <w:spacing w:before="240" w:beforeAutospacing="off" w:after="240" w:afterAutospacing="off"/>
+      </w:pPr>
+      <w:r>
+        <w:rPr>
+          <w:rFonts w:ascii="Aptos" w:hAnsi="Aptos" w:eastAsia="Aptos" w:cs="Aptos"/>
+          <w:noProof w:val="0"/>
+          <w:sz w:val="24"/>
+          <w:szCs w:val="24"/>
+          <w:lang w:val="pt-BR"/>
+        </w:rPr>
+        <w:t>Este serviço terá um conjunto de endpoints mais restrito, focado exclusivamente na segurança e na validação. Ele será acessado tanto pelo monolito quanto pelos clientes front-end.</w:t>
+      </w:r>
+    </w:p>
+    <w:p>
+      <w:pPr>
+        <w:pStyle w:val="PargrafodaLista"/>
+        <w:numPr>
+          <w:ilvl w:val="0"/>
+          <w:numId w:val="53"/>
+        </w:numPr>
+        <w:spacing w:before="240" w:beforeAutospacing="off" w:after="240" w:afterAutospacing="off"/>
+        <w:rPr>
+          <w:rFonts w:ascii="Aptos" w:hAnsi="Aptos" w:eastAsia="Aptos" w:cs="Aptos"/>
+          <w:noProof w:val="0"/>
+          <w:sz w:val="24"/>
+          <w:szCs w:val="24"/>
+          <w:lang w:val="pt-BR"/>
+        </w:rPr>
+      </w:pPr>
+      <w:r>
+        <w:rPr>
+          <w:rFonts w:ascii="Aptos" w:hAnsi="Aptos" w:eastAsia="Aptos" w:cs="Aptos"/>
+          <w:noProof w:val="0"/>
+          <w:sz w:val="24"/>
+          <w:szCs w:val="24"/>
+          <w:lang w:val="pt-BR"/>
+        </w:rPr>
+        <w:t>[POST] /api/auth/login/</w:t>
+      </w:r>
+    </w:p>
+    <w:p>
+      <w:pPr>
+        <w:pStyle w:val="PargrafodaLista"/>
+        <w:numPr>
+          <w:ilvl w:val="1"/>
+          <w:numId w:val="53"/>
+        </w:numPr>
+        <w:spacing w:before="240" w:beforeAutospacing="off" w:after="240" w:afterAutospacing="off"/>
+        <w:rPr>
+          <w:rFonts w:ascii="Aptos" w:hAnsi="Aptos" w:eastAsia="Aptos" w:cs="Aptos"/>
+          <w:noProof w:val="0"/>
+          <w:sz w:val="24"/>
+          <w:szCs w:val="24"/>
+          <w:lang w:val="pt-BR"/>
+        </w:rPr>
+      </w:pPr>
+      <w:r>
+        <w:rPr>
+          <w:rFonts w:ascii="Aptos" w:hAnsi="Aptos" w:eastAsia="Aptos" w:cs="Aptos"/>
+          <w:b w:val="1"/>
+          <w:bCs w:val="1"/>
+          <w:noProof w:val="0"/>
+          <w:sz w:val="24"/>
+          <w:szCs w:val="24"/>
+          <w:lang w:val="pt-BR"/>
+        </w:rPr>
+        <w:t>Função:</w:t>
+      </w:r>
+      <w:r>
+        <w:rPr>
+          <w:rFonts w:ascii="Aptos" w:hAnsi="Aptos" w:eastAsia="Aptos" w:cs="Aptos"/>
+          <w:noProof w:val="0"/>
+          <w:sz w:val="24"/>
+          <w:szCs w:val="24"/>
+          <w:lang w:val="pt-BR"/>
+        </w:rPr>
+        <w:t xml:space="preserve"> Autentica um usuário e retorna um </w:t>
+      </w:r>
+      <w:r>
+        <w:rPr>
+          <w:rFonts w:ascii="Aptos" w:hAnsi="Aptos" w:eastAsia="Aptos" w:cs="Aptos"/>
+          <w:b w:val="1"/>
+          <w:bCs w:val="1"/>
+          <w:noProof w:val="0"/>
+          <w:sz w:val="24"/>
+          <w:szCs w:val="24"/>
+          <w:lang w:val="pt-BR"/>
+        </w:rPr>
+        <w:t>JWT (JSON Web Token)</w:t>
+      </w:r>
+      <w:r>
+        <w:rPr>
+          <w:rFonts w:ascii="Aptos" w:hAnsi="Aptos" w:eastAsia="Aptos" w:cs="Aptos"/>
+          <w:noProof w:val="0"/>
+          <w:sz w:val="24"/>
+          <w:szCs w:val="24"/>
+          <w:lang w:val="pt-BR"/>
+        </w:rPr>
+        <w:t>.</w:t>
+      </w:r>
+    </w:p>
+    <w:p>
+      <w:pPr>
+        <w:pStyle w:val="PargrafodaLista"/>
+        <w:numPr>
+          <w:ilvl w:val="1"/>
+          <w:numId w:val="53"/>
+        </w:numPr>
+        <w:spacing w:before="240" w:beforeAutospacing="off" w:after="240" w:afterAutospacing="off"/>
+        <w:rPr>
+          <w:rFonts w:ascii="Aptos" w:hAnsi="Aptos" w:eastAsia="Aptos" w:cs="Aptos"/>
+          <w:noProof w:val="0"/>
+          <w:sz w:val="24"/>
+          <w:szCs w:val="24"/>
+          <w:lang w:val="pt-BR"/>
+        </w:rPr>
+      </w:pPr>
+      <w:r>
+        <w:rPr>
+          <w:rFonts w:ascii="Aptos" w:hAnsi="Aptos" w:eastAsia="Aptos" w:cs="Aptos"/>
+          <w:b w:val="1"/>
+          <w:bCs w:val="1"/>
+          <w:noProof w:val="0"/>
+          <w:sz w:val="24"/>
+          <w:szCs w:val="24"/>
+          <w:lang w:val="pt-BR"/>
+        </w:rPr>
+        <w:t>Corpo da requisição:</w:t>
+      </w:r>
+      <w:r>
+        <w:rPr>
+          <w:rFonts w:ascii="Aptos" w:hAnsi="Aptos" w:eastAsia="Aptos" w:cs="Aptos"/>
+          <w:noProof w:val="0"/>
+          <w:sz w:val="24"/>
+          <w:szCs w:val="24"/>
+          <w:lang w:val="pt-BR"/>
+        </w:rPr>
+        <w:t xml:space="preserve"> username e password.</w:t>
+      </w:r>
+    </w:p>
+    <w:p>
+      <w:pPr>
+        <w:pStyle w:val="PargrafodaLista"/>
+        <w:numPr>
+          <w:ilvl w:val="1"/>
+          <w:numId w:val="53"/>
+        </w:numPr>
+        <w:spacing w:before="240" w:beforeAutospacing="off" w:after="240" w:afterAutospacing="off"/>
+        <w:rPr>
+          <w:rFonts w:ascii="Aptos" w:hAnsi="Aptos" w:eastAsia="Aptos" w:cs="Aptos"/>
+          <w:noProof w:val="0"/>
+          <w:sz w:val="24"/>
+          <w:szCs w:val="24"/>
+          <w:lang w:val="pt-BR"/>
+        </w:rPr>
+      </w:pPr>
+      <w:r>
+        <w:rPr>
+          <w:rFonts w:ascii="Aptos" w:hAnsi="Aptos" w:eastAsia="Aptos" w:cs="Aptos"/>
+          <w:b w:val="1"/>
+          <w:bCs w:val="1"/>
+          <w:noProof w:val="0"/>
+          <w:sz w:val="24"/>
+          <w:szCs w:val="24"/>
+          <w:lang w:val="pt-BR"/>
+        </w:rPr>
+        <w:t>Resposta:</w:t>
+      </w:r>
+      <w:r>
+        <w:rPr>
+          <w:rFonts w:ascii="Aptos" w:hAnsi="Aptos" w:eastAsia="Aptos" w:cs="Aptos"/>
+          <w:noProof w:val="0"/>
+          <w:sz w:val="24"/>
+          <w:szCs w:val="24"/>
+          <w:lang w:val="pt-BR"/>
+        </w:rPr>
+        <w:t xml:space="preserve"> { "token": "seu-jwt-aqui" }</w:t>
+      </w:r>
+    </w:p>
+    <w:p>
+      <w:pPr>
+        <w:pStyle w:val="PargrafodaLista"/>
+        <w:numPr>
+          <w:ilvl w:val="0"/>
+          <w:numId w:val="53"/>
+        </w:numPr>
+        <w:spacing w:before="240" w:beforeAutospacing="off" w:after="240" w:afterAutospacing="off"/>
+        <w:rPr>
+          <w:rFonts w:ascii="Aptos" w:hAnsi="Aptos" w:eastAsia="Aptos" w:cs="Aptos"/>
+          <w:noProof w:val="0"/>
+          <w:sz w:val="24"/>
+          <w:szCs w:val="24"/>
+          <w:lang w:val="pt-BR"/>
+        </w:rPr>
+      </w:pPr>
+      <w:r>
+        <w:rPr>
+          <w:rFonts w:ascii="Aptos" w:hAnsi="Aptos" w:eastAsia="Aptos" w:cs="Aptos"/>
+          <w:noProof w:val="0"/>
+          <w:sz w:val="24"/>
+          <w:szCs w:val="24"/>
+          <w:lang w:val="pt-BR"/>
+        </w:rPr>
+        <w:t>[GET] /api/auth/validate/</w:t>
+      </w:r>
+    </w:p>
+    <w:p>
+      <w:pPr>
+        <w:pStyle w:val="PargrafodaLista"/>
+        <w:numPr>
+          <w:ilvl w:val="1"/>
+          <w:numId w:val="53"/>
+        </w:numPr>
+        <w:spacing w:before="240" w:beforeAutospacing="off" w:after="240" w:afterAutospacing="off"/>
+        <w:rPr>
+          <w:rFonts w:ascii="Aptos" w:hAnsi="Aptos" w:eastAsia="Aptos" w:cs="Aptos"/>
+          <w:noProof w:val="0"/>
+          <w:sz w:val="24"/>
+          <w:szCs w:val="24"/>
+          <w:lang w:val="pt-BR"/>
+        </w:rPr>
+      </w:pPr>
+      <w:r>
+        <w:rPr>
+          <w:rFonts w:ascii="Aptos" w:hAnsi="Aptos" w:eastAsia="Aptos" w:cs="Aptos"/>
+          <w:b w:val="1"/>
+          <w:bCs w:val="1"/>
+          <w:noProof w:val="0"/>
+          <w:sz w:val="24"/>
+          <w:szCs w:val="24"/>
+          <w:lang w:val="pt-BR"/>
+        </w:rPr>
+        <w:t>Função:</w:t>
+      </w:r>
+      <w:r>
+        <w:rPr>
+          <w:rFonts w:ascii="Aptos" w:hAnsi="Aptos" w:eastAsia="Aptos" w:cs="Aptos"/>
+          <w:noProof w:val="0"/>
+          <w:sz w:val="24"/>
+          <w:szCs w:val="24"/>
+          <w:lang w:val="pt-BR"/>
+        </w:rPr>
+        <w:t xml:space="preserve"> Valida um JWT.</w:t>
+      </w:r>
+    </w:p>
+    <w:p>
+      <w:pPr>
+        <w:pStyle w:val="PargrafodaLista"/>
+        <w:numPr>
+          <w:ilvl w:val="1"/>
+          <w:numId w:val="53"/>
+        </w:numPr>
+        <w:spacing w:before="240" w:beforeAutospacing="off" w:after="240" w:afterAutospacing="off"/>
+        <w:rPr>
+          <w:rFonts w:ascii="Aptos" w:hAnsi="Aptos" w:eastAsia="Aptos" w:cs="Aptos"/>
+          <w:noProof w:val="0"/>
+          <w:sz w:val="24"/>
+          <w:szCs w:val="24"/>
+          <w:lang w:val="pt-BR"/>
+        </w:rPr>
+      </w:pPr>
+      <w:r>
+        <w:rPr>
+          <w:rFonts w:ascii="Aptos" w:hAnsi="Aptos" w:eastAsia="Aptos" w:cs="Aptos"/>
+          <w:b w:val="1"/>
+          <w:bCs w:val="1"/>
+          <w:noProof w:val="0"/>
+          <w:sz w:val="24"/>
+          <w:szCs w:val="24"/>
+          <w:lang w:val="pt-BR"/>
+        </w:rPr>
+        <w:t>Cabeçalho da requisição:</w:t>
+      </w:r>
+      <w:r>
+        <w:rPr>
+          <w:rFonts w:ascii="Aptos" w:hAnsi="Aptos" w:eastAsia="Aptos" w:cs="Aptos"/>
+          <w:noProof w:val="0"/>
+          <w:sz w:val="24"/>
+          <w:szCs w:val="24"/>
+          <w:lang w:val="pt-BR"/>
+        </w:rPr>
+        <w:t xml:space="preserve"> Authorization: Bearer &lt;seu-jwt&gt;.</w:t>
+      </w:r>
+    </w:p>
+    <w:p>
+      <w:pPr>
+        <w:pStyle w:val="PargrafodaLista"/>
+        <w:numPr>
+          <w:ilvl w:val="1"/>
+          <w:numId w:val="53"/>
+        </w:numPr>
+        <w:spacing w:before="240" w:beforeAutospacing="off" w:after="240" w:afterAutospacing="off"/>
+        <w:rPr>
+          <w:rFonts w:ascii="Aptos" w:hAnsi="Aptos" w:eastAsia="Aptos" w:cs="Aptos"/>
+          <w:noProof w:val="0"/>
+          <w:sz w:val="24"/>
+          <w:szCs w:val="24"/>
+          <w:lang w:val="pt-BR"/>
+        </w:rPr>
+      </w:pPr>
+      <w:r>
+        <w:rPr>
+          <w:rFonts w:ascii="Aptos" w:hAnsi="Aptos" w:eastAsia="Aptos" w:cs="Aptos"/>
+          <w:b w:val="1"/>
+          <w:bCs w:val="1"/>
+          <w:noProof w:val="0"/>
+          <w:sz w:val="24"/>
+          <w:szCs w:val="24"/>
+          <w:lang w:val="pt-BR"/>
+        </w:rPr>
+        <w:t>Resposta:</w:t>
+      </w:r>
+      <w:r>
+        <w:rPr>
+          <w:rFonts w:ascii="Aptos" w:hAnsi="Aptos" w:eastAsia="Aptos" w:cs="Aptos"/>
+          <w:noProof w:val="0"/>
+          <w:sz w:val="24"/>
+          <w:szCs w:val="24"/>
+          <w:lang w:val="pt-BR"/>
+        </w:rPr>
+        <w:t xml:space="preserve"> Se válido, retorna os dados do usuário; se inválido, retorna erro 401.</w:t>
+      </w:r>
+    </w:p>
+    <w:p>
+      <w:pPr>
+        <w:pStyle w:val="PargrafodaLista"/>
+        <w:numPr>
+          <w:ilvl w:val="0"/>
+          <w:numId w:val="53"/>
+        </w:numPr>
+        <w:spacing w:before="240" w:beforeAutospacing="off" w:after="240" w:afterAutospacing="off"/>
+        <w:rPr>
+          <w:rFonts w:ascii="Aptos" w:hAnsi="Aptos" w:eastAsia="Aptos" w:cs="Aptos"/>
+          <w:noProof w:val="0"/>
+          <w:sz w:val="24"/>
+          <w:szCs w:val="24"/>
+          <w:lang w:val="pt-BR"/>
+        </w:rPr>
+      </w:pPr>
+      <w:r>
+        <w:rPr>
+          <w:rFonts w:ascii="Aptos" w:hAnsi="Aptos" w:eastAsia="Aptos" w:cs="Aptos"/>
+          <w:noProof w:val="0"/>
+          <w:sz w:val="24"/>
+          <w:szCs w:val="24"/>
+          <w:lang w:val="pt-BR"/>
+        </w:rPr>
+        <w:t>[GET] /api/auth/permissions/</w:t>
+      </w:r>
+    </w:p>
+    <w:p>
+      <w:pPr>
+        <w:pStyle w:val="PargrafodaLista"/>
+        <w:numPr>
+          <w:ilvl w:val="1"/>
+          <w:numId w:val="53"/>
+        </w:numPr>
+        <w:spacing w:before="240" w:beforeAutospacing="off" w:after="240" w:afterAutospacing="off"/>
+        <w:rPr>
+          <w:rFonts w:ascii="Aptos" w:hAnsi="Aptos" w:eastAsia="Aptos" w:cs="Aptos"/>
+          <w:noProof w:val="0"/>
+          <w:sz w:val="24"/>
+          <w:szCs w:val="24"/>
+          <w:lang w:val="pt-BR"/>
+        </w:rPr>
+      </w:pPr>
+      <w:r>
+        <w:rPr>
+          <w:rFonts w:ascii="Aptos" w:hAnsi="Aptos" w:eastAsia="Aptos" w:cs="Aptos"/>
+          <w:b w:val="1"/>
+          <w:bCs w:val="1"/>
+          <w:noProof w:val="0"/>
+          <w:sz w:val="24"/>
+          <w:szCs w:val="24"/>
+          <w:lang w:val="pt-BR"/>
+        </w:rPr>
+        <w:t>Função:</w:t>
+      </w:r>
+      <w:r>
+        <w:rPr>
+          <w:rFonts w:ascii="Aptos" w:hAnsi="Aptos" w:eastAsia="Aptos" w:cs="Aptos"/>
+          <w:noProof w:val="0"/>
+          <w:sz w:val="24"/>
+          <w:szCs w:val="24"/>
+          <w:lang w:val="pt-BR"/>
+        </w:rPr>
+        <w:t xml:space="preserve"> Retorna as permissões do usuário logado.</w:t>
+      </w:r>
+    </w:p>
+    <w:p>
+      <w:pPr>
+        <w:pStyle w:val="PargrafodaLista"/>
+        <w:numPr>
+          <w:ilvl w:val="1"/>
+          <w:numId w:val="53"/>
+        </w:numPr>
+        <w:spacing w:before="240" w:beforeAutospacing="off" w:after="240" w:afterAutospacing="off"/>
+        <w:rPr>
+          <w:rFonts w:ascii="Aptos" w:hAnsi="Aptos" w:eastAsia="Aptos" w:cs="Aptos"/>
+          <w:noProof w:val="0"/>
+          <w:sz w:val="24"/>
+          <w:szCs w:val="24"/>
+          <w:lang w:val="pt-BR"/>
+        </w:rPr>
+      </w:pPr>
+      <w:r>
+        <w:rPr>
+          <w:rFonts w:ascii="Aptos" w:hAnsi="Aptos" w:eastAsia="Aptos" w:cs="Aptos"/>
+          <w:b w:val="1"/>
+          <w:bCs w:val="1"/>
+          <w:noProof w:val="0"/>
+          <w:sz w:val="24"/>
+          <w:szCs w:val="24"/>
+          <w:lang w:val="pt-BR"/>
+        </w:rPr>
+        <w:t>Cabeçalho da requisição:</w:t>
+      </w:r>
+      <w:r>
+        <w:rPr>
+          <w:rFonts w:ascii="Aptos" w:hAnsi="Aptos" w:eastAsia="Aptos" w:cs="Aptos"/>
+          <w:noProof w:val="0"/>
+          <w:sz w:val="24"/>
+          <w:szCs w:val="24"/>
+          <w:lang w:val="pt-BR"/>
+        </w:rPr>
+        <w:t xml:space="preserve"> Authorization: Bearer &lt;seu-jwt&gt;.</w:t>
+      </w:r>
+    </w:p>
+    <w:p>
+      <w:pPr>
+        <w:pStyle w:val="PargrafodaLista"/>
+        <w:numPr>
+          <w:ilvl w:val="1"/>
+          <w:numId w:val="53"/>
+        </w:numPr>
+        <w:spacing w:before="240" w:beforeAutospacing="off" w:after="240" w:afterAutospacing="off"/>
+        <w:rPr>
+          <w:rFonts w:ascii="Aptos" w:hAnsi="Aptos" w:eastAsia="Aptos" w:cs="Aptos"/>
+          <w:noProof w:val="0"/>
+          <w:sz w:val="24"/>
+          <w:szCs w:val="24"/>
+          <w:lang w:val="pt-BR"/>
+        </w:rPr>
+      </w:pPr>
+      <w:r>
+        <w:rPr>
+          <w:rFonts w:ascii="Aptos" w:hAnsi="Aptos" w:eastAsia="Aptos" w:cs="Aptos"/>
+          <w:b w:val="1"/>
+          <w:bCs w:val="1"/>
+          <w:noProof w:val="0"/>
+          <w:sz w:val="24"/>
+          <w:szCs w:val="24"/>
+          <w:lang w:val="pt-BR"/>
+        </w:rPr>
+        <w:t>Resposta:</w:t>
+      </w:r>
+      <w:r>
+        <w:rPr>
+          <w:rFonts w:ascii="Aptos" w:hAnsi="Aptos" w:eastAsia="Aptos" w:cs="Aptos"/>
+          <w:noProof w:val="0"/>
+          <w:sz w:val="24"/>
+          <w:szCs w:val="24"/>
+          <w:lang w:val="pt-BR"/>
+        </w:rPr>
+        <w:t xml:space="preserve"> { "permissions": ["patient:agendar_consulta", "medico:atualizar_prontuario"] }</w:t>
+      </w:r>
+    </w:p>
+    <w:p/>
+    <w:p>
+      <w:pPr>
+        <w:pStyle w:val="Ttulo3"/>
+        <w:spacing w:before="281" w:beforeAutospacing="off" w:after="281" w:afterAutospacing="off"/>
+      </w:pPr>
+      <w:r>
+        <w:rPr>
+          <w:rFonts w:ascii="Aptos" w:hAnsi="Aptos" w:eastAsia="Aptos" w:cs="Aptos"/>
+          <w:noProof w:val="0"/>
+          <w:sz w:val="24"/>
+          <w:szCs w:val="24"/>
+          <w:lang w:val="pt-BR"/>
+        </w:rPr>
+        <w:t>Como a Comunicação Funciona</w:t>
+      </w:r>
+    </w:p>
+    <w:p>
+      <w:pPr>
+        <w:spacing w:before="240" w:beforeAutospacing="off" w:after="240" w:afterAutospacing="off"/>
+      </w:pPr>
+      <w:r>
+        <w:rPr>
+          <w:rFonts w:ascii="Aptos" w:hAnsi="Aptos" w:eastAsia="Aptos" w:cs="Aptos"/>
+          <w:noProof w:val="0"/>
+          <w:sz w:val="24"/>
+          <w:szCs w:val="24"/>
+          <w:lang w:val="pt-BR"/>
+        </w:rPr>
+        <w:t>No seu monolito, você terá funções que fazem requisições para a API de autenticação. Por exemplo, antes de permitir que um paciente acesse um prontuário, o monolito faria uma chamada para o endpoint /api/auth/permissions/ para verificar se o token do usuário tem a permissão necessária.</w:t>
+      </w:r>
+    </w:p>
+    <w:p>
+      <w:pPr>
+        <w:pStyle w:val="Normal"/>
+        <w:spacing w:before="240" w:beforeAutospacing="off" w:after="240" w:afterAutospacing="off"/>
+        <w:rPr>
+          <w:rFonts w:ascii="Aptos" w:hAnsi="Aptos" w:eastAsia="Aptos" w:cs="Aptos"/>
+          <w:noProof w:val="0"/>
+          <w:sz w:val="24"/>
+          <w:szCs w:val="24"/>
+          <w:lang w:val="pt-BR"/>
+        </w:rPr>
+      </w:pPr>
+    </w:p>
+    <w:p>
+      <w:pPr>
+        <w:pStyle w:val="Normal"/>
+        <w:spacing w:before="240" w:beforeAutospacing="off" w:after="240" w:afterAutospacing="off"/>
+        <w:rPr>
+          <w:rFonts w:ascii="Aptos" w:hAnsi="Aptos" w:eastAsia="Aptos" w:cs="Aptos"/>
+          <w:noProof w:val="0"/>
+          <w:sz w:val="24"/>
+          <w:szCs w:val="24"/>
+          <w:lang w:val="pt-BR"/>
+        </w:rPr>
+      </w:pPr>
+    </w:p>
+    <w:p>
+      <w:pPr>
+        <w:pStyle w:val="Normal"/>
+      </w:pPr>
+    </w:p>
+    <w:p>
+      <w:pPr>
         <w:pStyle w:val="Ttulo1"/>
       </w:pPr>
       <w:bookmarkStart w:name="_Toc1831991996" w:id="5"/>
@@ -13217,6 +15474,539 @@
 
 <file path=word/numbering.xml><?xml version="1.0" encoding="utf-8"?>
 <w:numbering xmlns:wpc="http://schemas.microsoft.com/office/word/2010/wordprocessingCanvas" xmlns:cx="http://schemas.microsoft.com/office/drawing/2014/chartex" xmlns:cx1="http://schemas.microsoft.com/office/drawing/2015/9/8/chartex" xmlns:cx2="http://schemas.microsoft.com/office/drawing/2015/10/21/chartex" xmlns:cx3="http://schemas.microsoft.com/office/drawing/2016/5/9/chartex" xmlns:cx4="http://schemas.microsoft.com/office/drawing/2016/5/10/chartex" xmlns:cx5="http://schemas.microsoft.com/office/drawing/2016/5/11/chartex" xmlns:cx6="http://schemas.microsoft.com/office/drawing/2016/5/12/chartex" xmlns:cx7="http://schemas.microsoft.com/office/drawing/2016/5/13/chartex" xmlns:cx8="http://schemas.microsoft.com/office/drawing/2016/5/14/chartex" xmlns:mc="http://schemas.openxmlformats.org/markup-compatibility/2006" xmlns:aink="http://schemas.microsoft.com/office/drawing/2016/ink" xmlns:am3d="http://schemas.microsoft.com/office/drawing/2017/model3d" xmlns:o="urn:schemas-microsoft-com:office:office" xmlns:oel="http://schemas.microsoft.com/office/2019/extlst" xmlns:r="http://schemas.openxmlformats.org/officeDocument/2006/relationships" xmlns:m="http://schemas.openxmlformats.org/officeDocument/2006/math" xmlns:v="urn:schemas-microsoft-com:vml" xmlns:wp14="http://schemas.microsoft.com/office/word/2010/wordprocessingDrawing" xmlns:wp="http://schemas.openxmlformats.org/drawingml/2006/wordprocessingDrawing" xmlns:w10="urn:schemas-microsoft-com:office:word" xmlns:w="http://schemas.openxmlformats.org/wordprocessingml/2006/main" xmlns:w14="http://schemas.microsoft.com/office/word/2010/wordml" xmlns:w15="http://schemas.microsoft.com/office/word/2012/wordml" xmlns:w16cex="http://schemas.microsoft.com/office/word/2018/wordml/cex" xmlns:w16cid="http://schemas.microsoft.com/office/word/2016/wordml/cid" xmlns:w16="http://schemas.microsoft.com/office/word/2018/wordml" xmlns:w16du="http://schemas.microsoft.com/office/word/2023/wordml/word16du" xmlns:w16sdtdh="http://schemas.microsoft.com/office/word/2020/wordml/sdtdatahash" xmlns:w16sdtfl="http://schemas.microsoft.com/office/word/2024/wordml/sdtformatlock" xmlns:w16se="http://schemas.microsoft.com/office/word/2015/wordml/symex" xmlns:wpg="http://schemas.microsoft.com/office/word/2010/wordprocessingGroup" xmlns:wpi="http://schemas.microsoft.com/office/word/2010/wordprocessingInk" xmlns:wne="http://schemas.microsoft.com/office/word/2006/wordml" xmlns:wps="http://schemas.microsoft.com/office/word/2010/wordprocessingShape" mc:Ignorable="w14 w15 w16se w16cid w16 w16cex w16sdtdh w16sdtfl w16du wp14">
+  <w:abstractNum xmlns:w="http://schemas.openxmlformats.org/wordprocessingml/2006/main" w:abstractNumId="52">
+    <w:nsid w:val="432a57c8"/>
+    <w:multiLevelType xmlns:w="http://schemas.openxmlformats.org/wordprocessingml/2006/main" w:val="hybridMultilevel"/>
+    <w:lvl xmlns:w="http://schemas.openxmlformats.org/wordprocessingml/2006/main" w:ilvl="0">
+      <w:start w:val="1"/>
+      <w:numFmt w:val="bullet"/>
+      <w:lvlText w:val=""/>
+      <w:lvlJc w:val="left"/>
+      <w:pPr>
+        <w:ind w:left="720" w:hanging="360"/>
+      </w:pPr>
+      <w:rPr>
+        <w:rFonts w:hint="default" w:ascii="Symbol" w:hAnsi="Symbol"/>
+      </w:rPr>
+    </w:lvl>
+    <w:lvl xmlns:w="http://schemas.openxmlformats.org/wordprocessingml/2006/main" w:ilvl="1">
+      <w:start w:val="1"/>
+      <w:numFmt w:val="bullet"/>
+      <w:lvlText w:val="o"/>
+      <w:lvlJc w:val="left"/>
+      <w:pPr>
+        <w:ind w:left="1440" w:hanging="360"/>
+      </w:pPr>
+      <w:rPr>
+        <w:rFonts w:hint="default" w:ascii="Courier New" w:hAnsi="Courier New"/>
+      </w:rPr>
+    </w:lvl>
+    <w:lvl xmlns:w="http://schemas.openxmlformats.org/wordprocessingml/2006/main" w:ilvl="2">
+      <w:start w:val="1"/>
+      <w:numFmt w:val="bullet"/>
+      <w:lvlText w:val=""/>
+      <w:lvlJc w:val="left"/>
+      <w:pPr>
+        <w:ind w:left="2160" w:hanging="360"/>
+      </w:pPr>
+      <w:rPr>
+        <w:rFonts w:hint="default" w:ascii="Wingdings" w:hAnsi="Wingdings"/>
+      </w:rPr>
+    </w:lvl>
+    <w:lvl xmlns:w="http://schemas.openxmlformats.org/wordprocessingml/2006/main" w:ilvl="3">
+      <w:start w:val="1"/>
+      <w:numFmt w:val="bullet"/>
+      <w:lvlText w:val=""/>
+      <w:lvlJc w:val="left"/>
+      <w:pPr>
+        <w:ind w:left="2880" w:hanging="360"/>
+      </w:pPr>
+      <w:rPr>
+        <w:rFonts w:hint="default" w:ascii="Symbol" w:hAnsi="Symbol"/>
+      </w:rPr>
+    </w:lvl>
+    <w:lvl xmlns:w="http://schemas.openxmlformats.org/wordprocessingml/2006/main" w:ilvl="4">
+      <w:start w:val="1"/>
+      <w:numFmt w:val="bullet"/>
+      <w:lvlText w:val="o"/>
+      <w:lvlJc w:val="left"/>
+      <w:pPr>
+        <w:ind w:left="3600" w:hanging="360"/>
+      </w:pPr>
+      <w:rPr>
+        <w:rFonts w:hint="default" w:ascii="Courier New" w:hAnsi="Courier New"/>
+      </w:rPr>
+    </w:lvl>
+    <w:lvl xmlns:w="http://schemas.openxmlformats.org/wordprocessingml/2006/main" w:ilvl="5">
+      <w:start w:val="1"/>
+      <w:numFmt w:val="bullet"/>
+      <w:lvlText w:val=""/>
+      <w:lvlJc w:val="left"/>
+      <w:pPr>
+        <w:ind w:left="4320" w:hanging="360"/>
+      </w:pPr>
+      <w:rPr>
+        <w:rFonts w:hint="default" w:ascii="Wingdings" w:hAnsi="Wingdings"/>
+      </w:rPr>
+    </w:lvl>
+    <w:lvl xmlns:w="http://schemas.openxmlformats.org/wordprocessingml/2006/main" w:ilvl="6">
+      <w:start w:val="1"/>
+      <w:numFmt w:val="bullet"/>
+      <w:lvlText w:val=""/>
+      <w:lvlJc w:val="left"/>
+      <w:pPr>
+        <w:ind w:left="5040" w:hanging="360"/>
+      </w:pPr>
+      <w:rPr>
+        <w:rFonts w:hint="default" w:ascii="Symbol" w:hAnsi="Symbol"/>
+      </w:rPr>
+    </w:lvl>
+    <w:lvl xmlns:w="http://schemas.openxmlformats.org/wordprocessingml/2006/main" w:ilvl="7">
+      <w:start w:val="1"/>
+      <w:numFmt w:val="bullet"/>
+      <w:lvlText w:val="o"/>
+      <w:lvlJc w:val="left"/>
+      <w:pPr>
+        <w:ind w:left="5760" w:hanging="360"/>
+      </w:pPr>
+      <w:rPr>
+        <w:rFonts w:hint="default" w:ascii="Courier New" w:hAnsi="Courier New"/>
+      </w:rPr>
+    </w:lvl>
+    <w:lvl xmlns:w="http://schemas.openxmlformats.org/wordprocessingml/2006/main" w:ilvl="8">
+      <w:start w:val="1"/>
+      <w:numFmt w:val="bullet"/>
+      <w:lvlText w:val=""/>
+      <w:lvlJc w:val="left"/>
+      <w:pPr>
+        <w:ind w:left="6480" w:hanging="360"/>
+      </w:pPr>
+      <w:rPr>
+        <w:rFonts w:hint="default" w:ascii="Wingdings" w:hAnsi="Wingdings"/>
+      </w:rPr>
+    </w:lvl>
+  </w:abstractNum>
+  <w:abstractNum xmlns:w="http://schemas.openxmlformats.org/wordprocessingml/2006/main" w:abstractNumId="51">
+    <w:nsid w:val="79627fcf"/>
+    <w:multiLevelType xmlns:w="http://schemas.openxmlformats.org/wordprocessingml/2006/main" w:val="hybridMultilevel"/>
+    <w:lvl xmlns:w="http://schemas.openxmlformats.org/wordprocessingml/2006/main" w:ilvl="0">
+      <w:start w:val="1"/>
+      <w:numFmt w:val="bullet"/>
+      <w:lvlText w:val=""/>
+      <w:lvlJc w:val="left"/>
+      <w:pPr>
+        <w:ind w:left="720" w:hanging="360"/>
+      </w:pPr>
+      <w:rPr>
+        <w:rFonts w:hint="default" w:ascii="Symbol" w:hAnsi="Symbol"/>
+      </w:rPr>
+    </w:lvl>
+    <w:lvl xmlns:w="http://schemas.openxmlformats.org/wordprocessingml/2006/main" w:ilvl="1">
+      <w:start w:val="1"/>
+      <w:numFmt w:val="bullet"/>
+      <w:lvlText w:val="o"/>
+      <w:lvlJc w:val="left"/>
+      <w:pPr>
+        <w:ind w:left="1440" w:hanging="360"/>
+      </w:pPr>
+      <w:rPr>
+        <w:rFonts w:hint="default" w:ascii="Courier New" w:hAnsi="Courier New"/>
+      </w:rPr>
+    </w:lvl>
+    <w:lvl xmlns:w="http://schemas.openxmlformats.org/wordprocessingml/2006/main" w:ilvl="2">
+      <w:start w:val="1"/>
+      <w:numFmt w:val="bullet"/>
+      <w:lvlText w:val=""/>
+      <w:lvlJc w:val="left"/>
+      <w:pPr>
+        <w:ind w:left="2160" w:hanging="360"/>
+      </w:pPr>
+      <w:rPr>
+        <w:rFonts w:hint="default" w:ascii="Wingdings" w:hAnsi="Wingdings"/>
+      </w:rPr>
+    </w:lvl>
+    <w:lvl xmlns:w="http://schemas.openxmlformats.org/wordprocessingml/2006/main" w:ilvl="3">
+      <w:start w:val="1"/>
+      <w:numFmt w:val="bullet"/>
+      <w:lvlText w:val=""/>
+      <w:lvlJc w:val="left"/>
+      <w:pPr>
+        <w:ind w:left="2880" w:hanging="360"/>
+      </w:pPr>
+      <w:rPr>
+        <w:rFonts w:hint="default" w:ascii="Symbol" w:hAnsi="Symbol"/>
+      </w:rPr>
+    </w:lvl>
+    <w:lvl xmlns:w="http://schemas.openxmlformats.org/wordprocessingml/2006/main" w:ilvl="4">
+      <w:start w:val="1"/>
+      <w:numFmt w:val="bullet"/>
+      <w:lvlText w:val="o"/>
+      <w:lvlJc w:val="left"/>
+      <w:pPr>
+        <w:ind w:left="3600" w:hanging="360"/>
+      </w:pPr>
+      <w:rPr>
+        <w:rFonts w:hint="default" w:ascii="Courier New" w:hAnsi="Courier New"/>
+      </w:rPr>
+    </w:lvl>
+    <w:lvl xmlns:w="http://schemas.openxmlformats.org/wordprocessingml/2006/main" w:ilvl="5">
+      <w:start w:val="1"/>
+      <w:numFmt w:val="bullet"/>
+      <w:lvlText w:val=""/>
+      <w:lvlJc w:val="left"/>
+      <w:pPr>
+        <w:ind w:left="4320" w:hanging="360"/>
+      </w:pPr>
+      <w:rPr>
+        <w:rFonts w:hint="default" w:ascii="Wingdings" w:hAnsi="Wingdings"/>
+      </w:rPr>
+    </w:lvl>
+    <w:lvl xmlns:w="http://schemas.openxmlformats.org/wordprocessingml/2006/main" w:ilvl="6">
+      <w:start w:val="1"/>
+      <w:numFmt w:val="bullet"/>
+      <w:lvlText w:val=""/>
+      <w:lvlJc w:val="left"/>
+      <w:pPr>
+        <w:ind w:left="5040" w:hanging="360"/>
+      </w:pPr>
+      <w:rPr>
+        <w:rFonts w:hint="default" w:ascii="Symbol" w:hAnsi="Symbol"/>
+      </w:rPr>
+    </w:lvl>
+    <w:lvl xmlns:w="http://schemas.openxmlformats.org/wordprocessingml/2006/main" w:ilvl="7">
+      <w:start w:val="1"/>
+      <w:numFmt w:val="bullet"/>
+      <w:lvlText w:val="o"/>
+      <w:lvlJc w:val="left"/>
+      <w:pPr>
+        <w:ind w:left="5760" w:hanging="360"/>
+      </w:pPr>
+      <w:rPr>
+        <w:rFonts w:hint="default" w:ascii="Courier New" w:hAnsi="Courier New"/>
+      </w:rPr>
+    </w:lvl>
+    <w:lvl xmlns:w="http://schemas.openxmlformats.org/wordprocessingml/2006/main" w:ilvl="8">
+      <w:start w:val="1"/>
+      <w:numFmt w:val="bullet"/>
+      <w:lvlText w:val=""/>
+      <w:lvlJc w:val="left"/>
+      <w:pPr>
+        <w:ind w:left="6480" w:hanging="360"/>
+      </w:pPr>
+      <w:rPr>
+        <w:rFonts w:hint="default" w:ascii="Wingdings" w:hAnsi="Wingdings"/>
+      </w:rPr>
+    </w:lvl>
+  </w:abstractNum>
+  <w:abstractNum xmlns:w="http://schemas.openxmlformats.org/wordprocessingml/2006/main" w:abstractNumId="50">
+    <w:nsid w:val="67ef1cac"/>
+    <w:multiLevelType xmlns:w="http://schemas.openxmlformats.org/wordprocessingml/2006/main" w:val="hybridMultilevel"/>
+    <w:lvl xmlns:w="http://schemas.openxmlformats.org/wordprocessingml/2006/main" w:ilvl="0">
+      <w:start w:val="1"/>
+      <w:numFmt w:val="bullet"/>
+      <w:lvlText w:val=""/>
+      <w:lvlJc w:val="left"/>
+      <w:pPr>
+        <w:ind w:left="720" w:hanging="360"/>
+      </w:pPr>
+      <w:rPr>
+        <w:rFonts w:hint="default" w:ascii="Symbol" w:hAnsi="Symbol"/>
+      </w:rPr>
+    </w:lvl>
+    <w:lvl xmlns:w="http://schemas.openxmlformats.org/wordprocessingml/2006/main" w:ilvl="1">
+      <w:start w:val="1"/>
+      <w:numFmt w:val="bullet"/>
+      <w:lvlText w:val="o"/>
+      <w:lvlJc w:val="left"/>
+      <w:pPr>
+        <w:ind w:left="1440" w:hanging="360"/>
+      </w:pPr>
+      <w:rPr>
+        <w:rFonts w:hint="default" w:ascii="Courier New" w:hAnsi="Courier New"/>
+      </w:rPr>
+    </w:lvl>
+    <w:lvl xmlns:w="http://schemas.openxmlformats.org/wordprocessingml/2006/main" w:ilvl="2">
+      <w:start w:val="1"/>
+      <w:numFmt w:val="bullet"/>
+      <w:lvlText w:val=""/>
+      <w:lvlJc w:val="left"/>
+      <w:pPr>
+        <w:ind w:left="2160" w:hanging="360"/>
+      </w:pPr>
+      <w:rPr>
+        <w:rFonts w:hint="default" w:ascii="Wingdings" w:hAnsi="Wingdings"/>
+      </w:rPr>
+    </w:lvl>
+    <w:lvl xmlns:w="http://schemas.openxmlformats.org/wordprocessingml/2006/main" w:ilvl="3">
+      <w:start w:val="1"/>
+      <w:numFmt w:val="bullet"/>
+      <w:lvlText w:val=""/>
+      <w:lvlJc w:val="left"/>
+      <w:pPr>
+        <w:ind w:left="2880" w:hanging="360"/>
+      </w:pPr>
+      <w:rPr>
+        <w:rFonts w:hint="default" w:ascii="Symbol" w:hAnsi="Symbol"/>
+      </w:rPr>
+    </w:lvl>
+    <w:lvl xmlns:w="http://schemas.openxmlformats.org/wordprocessingml/2006/main" w:ilvl="4">
+      <w:start w:val="1"/>
+      <w:numFmt w:val="bullet"/>
+      <w:lvlText w:val="o"/>
+      <w:lvlJc w:val="left"/>
+      <w:pPr>
+        <w:ind w:left="3600" w:hanging="360"/>
+      </w:pPr>
+      <w:rPr>
+        <w:rFonts w:hint="default" w:ascii="Courier New" w:hAnsi="Courier New"/>
+      </w:rPr>
+    </w:lvl>
+    <w:lvl xmlns:w="http://schemas.openxmlformats.org/wordprocessingml/2006/main" w:ilvl="5">
+      <w:start w:val="1"/>
+      <w:numFmt w:val="bullet"/>
+      <w:lvlText w:val=""/>
+      <w:lvlJc w:val="left"/>
+      <w:pPr>
+        <w:ind w:left="4320" w:hanging="360"/>
+      </w:pPr>
+      <w:rPr>
+        <w:rFonts w:hint="default" w:ascii="Wingdings" w:hAnsi="Wingdings"/>
+      </w:rPr>
+    </w:lvl>
+    <w:lvl xmlns:w="http://schemas.openxmlformats.org/wordprocessingml/2006/main" w:ilvl="6">
+      <w:start w:val="1"/>
+      <w:numFmt w:val="bullet"/>
+      <w:lvlText w:val=""/>
+      <w:lvlJc w:val="left"/>
+      <w:pPr>
+        <w:ind w:left="5040" w:hanging="360"/>
+      </w:pPr>
+      <w:rPr>
+        <w:rFonts w:hint="default" w:ascii="Symbol" w:hAnsi="Symbol"/>
+      </w:rPr>
+    </w:lvl>
+    <w:lvl xmlns:w="http://schemas.openxmlformats.org/wordprocessingml/2006/main" w:ilvl="7">
+      <w:start w:val="1"/>
+      <w:numFmt w:val="bullet"/>
+      <w:lvlText w:val="o"/>
+      <w:lvlJc w:val="left"/>
+      <w:pPr>
+        <w:ind w:left="5760" w:hanging="360"/>
+      </w:pPr>
+      <w:rPr>
+        <w:rFonts w:hint="default" w:ascii="Courier New" w:hAnsi="Courier New"/>
+      </w:rPr>
+    </w:lvl>
+    <w:lvl xmlns:w="http://schemas.openxmlformats.org/wordprocessingml/2006/main" w:ilvl="8">
+      <w:start w:val="1"/>
+      <w:numFmt w:val="bullet"/>
+      <w:lvlText w:val=""/>
+      <w:lvlJc w:val="left"/>
+      <w:pPr>
+        <w:ind w:left="6480" w:hanging="360"/>
+      </w:pPr>
+      <w:rPr>
+        <w:rFonts w:hint="default" w:ascii="Wingdings" w:hAnsi="Wingdings"/>
+      </w:rPr>
+    </w:lvl>
+  </w:abstractNum>
+  <w:abstractNum xmlns:w="http://schemas.openxmlformats.org/wordprocessingml/2006/main" w:abstractNumId="49">
+    <w:nsid w:val="2a8d1610"/>
+    <w:multiLevelType xmlns:w="http://schemas.openxmlformats.org/wordprocessingml/2006/main" w:val="hybridMultilevel"/>
+    <w:lvl xmlns:w="http://schemas.openxmlformats.org/wordprocessingml/2006/main" w:ilvl="0">
+      <w:start w:val="1"/>
+      <w:numFmt w:val="bullet"/>
+      <w:lvlText w:val=""/>
+      <w:lvlJc w:val="left"/>
+      <w:pPr>
+        <w:ind w:left="720" w:hanging="360"/>
+      </w:pPr>
+      <w:rPr>
+        <w:rFonts w:hint="default" w:ascii="Symbol" w:hAnsi="Symbol"/>
+      </w:rPr>
+    </w:lvl>
+    <w:lvl xmlns:w="http://schemas.openxmlformats.org/wordprocessingml/2006/main" w:ilvl="1">
+      <w:start w:val="1"/>
+      <w:numFmt w:val="bullet"/>
+      <w:lvlText w:val="o"/>
+      <w:lvlJc w:val="left"/>
+      <w:pPr>
+        <w:ind w:left="1440" w:hanging="360"/>
+      </w:pPr>
+      <w:rPr>
+        <w:rFonts w:hint="default" w:ascii="Courier New" w:hAnsi="Courier New"/>
+      </w:rPr>
+    </w:lvl>
+    <w:lvl xmlns:w="http://schemas.openxmlformats.org/wordprocessingml/2006/main" w:ilvl="2">
+      <w:start w:val="1"/>
+      <w:numFmt w:val="bullet"/>
+      <w:lvlText w:val=""/>
+      <w:lvlJc w:val="left"/>
+      <w:pPr>
+        <w:ind w:left="2160" w:hanging="360"/>
+      </w:pPr>
+      <w:rPr>
+        <w:rFonts w:hint="default" w:ascii="Wingdings" w:hAnsi="Wingdings"/>
+      </w:rPr>
+    </w:lvl>
+    <w:lvl xmlns:w="http://schemas.openxmlformats.org/wordprocessingml/2006/main" w:ilvl="3">
+      <w:start w:val="1"/>
+      <w:numFmt w:val="bullet"/>
+      <w:lvlText w:val=""/>
+      <w:lvlJc w:val="left"/>
+      <w:pPr>
+        <w:ind w:left="2880" w:hanging="360"/>
+      </w:pPr>
+      <w:rPr>
+        <w:rFonts w:hint="default" w:ascii="Symbol" w:hAnsi="Symbol"/>
+      </w:rPr>
+    </w:lvl>
+    <w:lvl xmlns:w="http://schemas.openxmlformats.org/wordprocessingml/2006/main" w:ilvl="4">
+      <w:start w:val="1"/>
+      <w:numFmt w:val="bullet"/>
+      <w:lvlText w:val="o"/>
+      <w:lvlJc w:val="left"/>
+      <w:pPr>
+        <w:ind w:left="3600" w:hanging="360"/>
+      </w:pPr>
+      <w:rPr>
+        <w:rFonts w:hint="default" w:ascii="Courier New" w:hAnsi="Courier New"/>
+      </w:rPr>
+    </w:lvl>
+    <w:lvl xmlns:w="http://schemas.openxmlformats.org/wordprocessingml/2006/main" w:ilvl="5">
+      <w:start w:val="1"/>
+      <w:numFmt w:val="bullet"/>
+      <w:lvlText w:val=""/>
+      <w:lvlJc w:val="left"/>
+      <w:pPr>
+        <w:ind w:left="4320" w:hanging="360"/>
+      </w:pPr>
+      <w:rPr>
+        <w:rFonts w:hint="default" w:ascii="Wingdings" w:hAnsi="Wingdings"/>
+      </w:rPr>
+    </w:lvl>
+    <w:lvl xmlns:w="http://schemas.openxmlformats.org/wordprocessingml/2006/main" w:ilvl="6">
+      <w:start w:val="1"/>
+      <w:numFmt w:val="bullet"/>
+      <w:lvlText w:val=""/>
+      <w:lvlJc w:val="left"/>
+      <w:pPr>
+        <w:ind w:left="5040" w:hanging="360"/>
+      </w:pPr>
+      <w:rPr>
+        <w:rFonts w:hint="default" w:ascii="Symbol" w:hAnsi="Symbol"/>
+      </w:rPr>
+    </w:lvl>
+    <w:lvl xmlns:w="http://schemas.openxmlformats.org/wordprocessingml/2006/main" w:ilvl="7">
+      <w:start w:val="1"/>
+      <w:numFmt w:val="bullet"/>
+      <w:lvlText w:val="o"/>
+      <w:lvlJc w:val="left"/>
+      <w:pPr>
+        <w:ind w:left="5760" w:hanging="360"/>
+      </w:pPr>
+      <w:rPr>
+        <w:rFonts w:hint="default" w:ascii="Courier New" w:hAnsi="Courier New"/>
+      </w:rPr>
+    </w:lvl>
+    <w:lvl xmlns:w="http://schemas.openxmlformats.org/wordprocessingml/2006/main" w:ilvl="8">
+      <w:start w:val="1"/>
+      <w:numFmt w:val="bullet"/>
+      <w:lvlText w:val=""/>
+      <w:lvlJc w:val="left"/>
+      <w:pPr>
+        <w:ind w:left="6480" w:hanging="360"/>
+      </w:pPr>
+      <w:rPr>
+        <w:rFonts w:hint="default" w:ascii="Wingdings" w:hAnsi="Wingdings"/>
+      </w:rPr>
+    </w:lvl>
+  </w:abstractNum>
+  <w:abstractNum xmlns:w="http://schemas.openxmlformats.org/wordprocessingml/2006/main" w:abstractNumId="48">
+    <w:nsid w:val="53e58d58"/>
+    <w:multiLevelType xmlns:w="http://schemas.openxmlformats.org/wordprocessingml/2006/main" w:val="hybridMultilevel"/>
+    <w:lvl xmlns:w="http://schemas.openxmlformats.org/wordprocessingml/2006/main" w:ilvl="0">
+      <w:start w:val="1"/>
+      <w:numFmt w:val="decimal"/>
+      <w:lvlText w:val="%1."/>
+      <w:lvlJc w:val="left"/>
+      <w:pPr>
+        <w:ind w:left="720" w:hanging="360"/>
+      </w:pPr>
+    </w:lvl>
+    <w:lvl xmlns:w="http://schemas.openxmlformats.org/wordprocessingml/2006/main" w:ilvl="1">
+      <w:start w:val="1"/>
+      <w:numFmt w:val="lowerLetter"/>
+      <w:lvlText w:val="%2."/>
+      <w:lvlJc w:val="left"/>
+      <w:pPr>
+        <w:ind w:left="1440" w:hanging="360"/>
+      </w:pPr>
+    </w:lvl>
+    <w:lvl xmlns:w="http://schemas.openxmlformats.org/wordprocessingml/2006/main" w:ilvl="2">
+      <w:start w:val="1"/>
+      <w:numFmt w:val="lowerRoman"/>
+      <w:lvlText w:val="%3."/>
+      <w:lvlJc w:val="right"/>
+      <w:pPr>
+        <w:ind w:left="2160" w:hanging="180"/>
+      </w:pPr>
+    </w:lvl>
+    <w:lvl xmlns:w="http://schemas.openxmlformats.org/wordprocessingml/2006/main" w:ilvl="3">
+      <w:start w:val="1"/>
+      <w:numFmt w:val="decimal"/>
+      <w:lvlText w:val="%4."/>
+      <w:lvlJc w:val="left"/>
+      <w:pPr>
+        <w:ind w:left="2880" w:hanging="360"/>
+      </w:pPr>
+    </w:lvl>
+    <w:lvl xmlns:w="http://schemas.openxmlformats.org/wordprocessingml/2006/main" w:ilvl="4">
+      <w:start w:val="1"/>
+      <w:numFmt w:val="lowerLetter"/>
+      <w:lvlText w:val="%5."/>
+      <w:lvlJc w:val="left"/>
+      <w:pPr>
+        <w:ind w:left="3600" w:hanging="360"/>
+      </w:pPr>
+    </w:lvl>
+    <w:lvl xmlns:w="http://schemas.openxmlformats.org/wordprocessingml/2006/main" w:ilvl="5">
+      <w:start w:val="1"/>
+      <w:numFmt w:val="lowerRoman"/>
+      <w:lvlText w:val="%6."/>
+      <w:lvlJc w:val="right"/>
+      <w:pPr>
+        <w:ind w:left="4320" w:hanging="180"/>
+      </w:pPr>
+    </w:lvl>
+    <w:lvl xmlns:w="http://schemas.openxmlformats.org/wordprocessingml/2006/main" w:ilvl="6">
+      <w:start w:val="1"/>
+      <w:numFmt w:val="decimal"/>
+      <w:lvlText w:val="%7."/>
+      <w:lvlJc w:val="left"/>
+      <w:pPr>
+        <w:ind w:left="5040" w:hanging="360"/>
+      </w:pPr>
+    </w:lvl>
+    <w:lvl xmlns:w="http://schemas.openxmlformats.org/wordprocessingml/2006/main" w:ilvl="7">
+      <w:start w:val="1"/>
+      <w:numFmt w:val="lowerLetter"/>
+      <w:lvlText w:val="%8."/>
+      <w:lvlJc w:val="left"/>
+      <w:pPr>
+        <w:ind w:left="5760" w:hanging="360"/>
+      </w:pPr>
+    </w:lvl>
+    <w:lvl xmlns:w="http://schemas.openxmlformats.org/wordprocessingml/2006/main" w:ilvl="8">
+      <w:start w:val="1"/>
+      <w:numFmt w:val="lowerRoman"/>
+      <w:lvlText w:val="%9."/>
+      <w:lvlJc w:val="right"/>
+      <w:pPr>
+        <w:ind w:left="6480" w:hanging="180"/>
+      </w:pPr>
+    </w:lvl>
+  </w:abstractNum>
   <w:abstractNum xmlns:w="http://schemas.openxmlformats.org/wordprocessingml/2006/main" w:abstractNumId="47">
     <w:nsid w:val="76fcd3ca"/>
     <w:multiLevelType xmlns:w="http://schemas.openxmlformats.org/wordprocessingml/2006/main" w:val="hybridMultilevel"/>
@@ -18797,6 +21587,21 @@
       </w:rPr>
     </w:lvl>
   </w:abstractNum>
+  <w:num w:numId="53">
+    <w:abstractNumId w:val="52"/>
+  </w:num>
+  <w:num w:numId="52">
+    <w:abstractNumId w:val="51"/>
+  </w:num>
+  <w:num w:numId="51">
+    <w:abstractNumId w:val="50"/>
+  </w:num>
+  <w:num w:numId="50">
+    <w:abstractNumId w:val="49"/>
+  </w:num>
+  <w:num w:numId="49">
+    <w:abstractNumId w:val="48"/>
+  </w:num>
   <w:num w:numId="48">
     <w:abstractNumId w:val="47"/>
   </w:num>

</xml_diff>